<commit_message>
Report: new LT Clinic screenshots, including the Profile tab
Co-Authored-By: Claude Opus 5.5 <noreply@anthropic.com>
</commit_message>
<xml_diff>
--- a/docs/report/LifeTrack_Health_NTCC_Report.docx
+++ b/docs/report/LifeTrack_Health_NTCC_Report.docx
@@ -1269,6 +1269,18 @@
           <w:szCs w:val="22"/>
         </w:rPr>
         <w:t xml:space="preserve">Figure 5.4  LifeTrack Clinic: a shared summary and a prescription being written</w:t>
+      </w:r>
+    </w:p>
+    <w:p>
+      <w:pPr>
+        <w:spacing w:after="80"/>
+      </w:pPr>
+      <w:r>
+        <w:rPr>
+          <w:sz w:val="22"/>
+          <w:szCs w:val="22"/>
+        </w:rPr>
+        <w:t xml:space="preserve">Figure 5.5  LifeTrack Clinic: the Profile tab</w:t>
       </w:r>
     </w:p>
     <w:p>
@@ -10100,6 +10112,77 @@
           <w:szCs w:val="20"/>
         </w:rPr>
         <w:t xml:space="preserve">Figure 5.4: LifeTrack Clinic: a shared summary and a prescription being written</w:t>
+      </w:r>
+    </w:p>
+    <w:p>
+      <w:pPr>
+        <w:spacing w:after="160" w:line="360"/>
+        <w:jc w:val="both"/>
+      </w:pPr>
+      <w:r>
+        <w:t xml:space="preserve">The app has three tabs: Patients, Prescriptions and Profile. The Profile tab (Figure 5.5) shows the licence details from the approved enrolment, which the doctor cannot edit, and when the certificate next renews. It also holds the practice details printed on paper prescriptions, the privacy settings (the app lock is always on, and hiding from screenshots is a switch), the appearance setting and a count of what this device keeps.</w:t>
+      </w:r>
+    </w:p>
+    <w:p>
+      <w:pPr>
+        <w:keepNext/>
+        <w:spacing w:before="120"/>
+        <w:jc w:val="center"/>
+      </w:pPr>
+      <w:r>
+        <w:drawing>
+          <wp:inline distT="0" distB="0" distL="0" distR="0">
+            <wp:extent cx="5334000" cy="3371850"/>
+            <wp:effectExtent t="0" r="0" b="0" l="0"/>
+            <wp:docPr id="13" name="" descr="" title=""/>
+            <wp:cNvGraphicFramePr>
+              <a:graphicFrameLocks xmlns:a="http://schemas.openxmlformats.org/drawingml/2006/main" noChangeAspect="1"/>
+            </wp:cNvGraphicFramePr>
+            <a:graphic xmlns:a="http://schemas.openxmlformats.org/drawingml/2006/main">
+              <a:graphicData uri="http://schemas.openxmlformats.org/drawingml/2006/picture">
+                <pic:pic xmlns:pic="http://schemas.openxmlformats.org/drawingml/2006/picture">
+                  <pic:nvPicPr>
+                    <pic:cNvPr id="0" name="" descr=""/>
+                    <pic:cNvPicPr>
+                      <a:picLocks noChangeAspect="1" noChangeArrowheads="1"/>
+                    </pic:cNvPicPr>
+                  </pic:nvPicPr>
+                  <pic:blipFill>
+                    <a:blip r:embed="rId21" cstate="none"/>
+                    <a:srcRect/>
+                    <a:stretch>
+                      <a:fillRect/>
+                    </a:stretch>
+                  </pic:blipFill>
+                  <pic:spPr bwMode="auto">
+                    <a:xfrm>
+                      <a:off x="0" y="0"/>
+                      <a:ext cx="5334000" cy="3371850"/>
+                    </a:xfrm>
+                    <a:prstGeom prst="rect">
+                      <a:avLst/>
+                    </a:prstGeom>
+                  </pic:spPr>
+                </pic:pic>
+              </a:graphicData>
+            </a:graphic>
+          </wp:inline>
+        </w:drawing>
+      </w:r>
+    </w:p>
+    <w:p>
+      <w:pPr>
+        <w:spacing w:after="240"/>
+        <w:jc w:val="center"/>
+      </w:pPr>
+      <w:r>
+        <w:rPr>
+          <w:i/>
+          <w:iCs/>
+          <w:sz w:val="20"/>
+          <w:szCs w:val="20"/>
+        </w:rPr>
+        <w:t xml:space="preserve">Figure 5.5: LifeTrack Clinic: the Profile tab</w:t>
       </w:r>
     </w:p>
     <w:p>

</xml_diff>

<commit_message>
Report: final version for submission (solo author, details filled in, PDF with page-numbered contents)
Co-Authored-By: Claude Opus 5.5 <noreply@anthropic.com>
</commit_message>
<xml_diff>
--- a/docs/report/LifeTrack_Health_NTCC_Report.docx
+++ b/docs/report/LifeTrack_Health_NTCC_Report.docx
@@ -71,9 +71,8 @@
           <w:bCs/>
           <w:sz w:val="24"/>
           <w:szCs w:val="24"/>
-          <w:highlight w:val="yellow"/>
-        </w:rPr>
-        <w:t xml:space="preserve">[Programme, e.g. Bachelor of Science in Information Technology (B.Sc. IT)]</w:t>
+        </w:rPr>
+        <w:t xml:space="preserve">Bachelor of Science in Information Technology (B.Sc. IT)</w:t>
       </w:r>
     </w:p>
     <w:p/>
@@ -88,76 +87,6 @@
           <w:szCs w:val="24"/>
         </w:rPr>
         <w:t xml:space="preserve">Submitted by</w:t>
-      </w:r>
-    </w:p>
-    <w:p>
-      <w:pPr>
-        <w:spacing w:after="160" w:line="360"/>
-        <w:jc w:val="center"/>
-      </w:pPr>
-      <w:r>
-        <w:rPr>
-          <w:sz w:val="24"/>
-          <w:szCs w:val="24"/>
-          <w:highlight w:val="yellow"/>
-        </w:rPr>
-        <w:t xml:space="preserve">[Student 1 name — Enrolment no.]</w:t>
-      </w:r>
-    </w:p>
-    <w:p>
-      <w:pPr>
-        <w:spacing w:after="160" w:line="360"/>
-        <w:jc w:val="center"/>
-      </w:pPr>
-      <w:r>
-        <w:rPr>
-          <w:sz w:val="24"/>
-          <w:szCs w:val="24"/>
-          <w:highlight w:val="yellow"/>
-        </w:rPr>
-        <w:t xml:space="preserve">[Student 2 name — Enrolment no.]</w:t>
-      </w:r>
-    </w:p>
-    <w:p>
-      <w:pPr>
-        <w:spacing w:after="160" w:line="360"/>
-        <w:jc w:val="center"/>
-      </w:pPr>
-      <w:r>
-        <w:rPr>
-          <w:sz w:val="24"/>
-          <w:szCs w:val="24"/>
-          <w:highlight w:val="yellow"/>
-        </w:rPr>
-        <w:t xml:space="preserve">[Student 3 name — Enrolment no.]</w:t>
-      </w:r>
-    </w:p>
-    <w:p>
-      <w:pPr>
-        <w:spacing w:after="160" w:line="360"/>
-        <w:jc w:val="center"/>
-      </w:pPr>
-      <w:r>
-        <w:rPr>
-          <w:sz w:val="24"/>
-          <w:szCs w:val="24"/>
-          <w:highlight w:val="yellow"/>
-        </w:rPr>
-        <w:t xml:space="preserve">[Student 4 name — Enrolment no.]</w:t>
-      </w:r>
-    </w:p>
-    <w:p/>
-    <w:p>
-      <w:pPr>
-        <w:spacing w:after="160" w:line="360"/>
-        <w:jc w:val="center"/>
-      </w:pPr>
-      <w:r>
-        <w:rPr>
-          <w:sz w:val="24"/>
-          <w:szCs w:val="24"/>
-        </w:rPr>
-        <w:t xml:space="preserve">Under the supervision of</w:t>
       </w:r>
     </w:p>
     <w:p>
@@ -172,7 +101,7 @@
           <w:sz w:val="24"/>
           <w:szCs w:val="24"/>
         </w:rPr>
-        <w:t xml:space="preserve">Dr. Priyadarshini Gupta</w:t>
+        <w:t xml:space="preserve">Anish Raj</w:t>
       </w:r>
     </w:p>
     <w:p>
@@ -184,16 +113,50 @@
         <w:rPr>
           <w:sz w:val="24"/>
           <w:szCs w:val="24"/>
-          <w:highlight w:val="yellow"/>
-        </w:rPr>
-        <w:t xml:space="preserve">[Designation]</w:t>
-      </w:r>
+        </w:rPr>
+        <w:t xml:space="preserve">Enrolment No. A45304925031</w:t>
+      </w:r>
+    </w:p>
+    <w:p/>
+    <w:p>
+      <w:pPr>
+        <w:spacing w:after="160" w:line="360"/>
+        <w:jc w:val="center"/>
+      </w:pPr>
       <w:r>
         <w:rPr>
           <w:sz w:val="24"/>
           <w:szCs w:val="24"/>
         </w:rPr>
-        <w:t xml:space="preserve">, Amity Institute of Information Technology</w:t>
+        <w:t xml:space="preserve">Under the supervision of</w:t>
+      </w:r>
+    </w:p>
+    <w:p>
+      <w:pPr>
+        <w:spacing w:after="160" w:line="360"/>
+        <w:jc w:val="center"/>
+      </w:pPr>
+      <w:r>
+        <w:rPr>
+          <w:b/>
+          <w:bCs/>
+          <w:sz w:val="24"/>
+          <w:szCs w:val="24"/>
+        </w:rPr>
+        <w:t xml:space="preserve">Dr. Priyadarshini Gupta</w:t>
+      </w:r>
+    </w:p>
+    <w:p>
+      <w:pPr>
+        <w:spacing w:after="160" w:line="360"/>
+        <w:jc w:val="center"/>
+      </w:pPr>
+      <w:r>
+        <w:rPr>
+          <w:sz w:val="24"/>
+          <w:szCs w:val="24"/>
+        </w:rPr>
+        <w:t xml:space="preserve">Assistant Professor, Amity Institute of Information Technology</w:t>
       </w:r>
     </w:p>
     <w:p/>
@@ -251,22 +214,7 @@
           <w:sz w:val="24"/>
           <w:szCs w:val="24"/>
         </w:rPr>
-        <w:t xml:space="preserve">Academic Session </w:t>
-      </w:r>
-      <w:r>
-        <w:rPr>
-          <w:sz w:val="24"/>
-          <w:szCs w:val="24"/>
-          <w:highlight w:val="yellow"/>
-        </w:rPr>
-        <w:t xml:space="preserve">[2025–2028]</w:t>
-      </w:r>
-      <w:r>
-        <w:rPr>
-          <w:sz w:val="24"/>
-          <w:szCs w:val="24"/>
-        </w:rPr>
-        <w:t xml:space="preserve">  ·  October 2026</w:t>
+        <w:t xml:space="preserve">Academic Session 2025–2028  ·  October 2026</w:t>
       </w:r>
     </w:p>
     <w:p>
@@ -294,7 +242,7 @@
         <w:jc w:val="both"/>
       </w:pPr>
       <w:r>
-        <w:t xml:space="preserve">We hereby declare that the project report entitled </w:t>
+        <w:t xml:space="preserve">I hereby declare that the project report entitled </w:t>
       </w:r>
       <w:r>
         <w:rPr>
@@ -304,16 +252,7 @@
         <w:t xml:space="preserve">“LifeTrack Health: A Patient-Owned, Local-First Health Record with Consent-Controlled Sharing”</w:t>
       </w:r>
       <w:r>
-        <w:t xml:space="preserve">, submitted to Amity Institute of Information Technology, Amity University Patna, in partial fulfilment of the requirements for the degree of </w:t>
-      </w:r>
-      <w:r>
-        <w:rPr>
-          <w:highlight w:val="yellow"/>
-        </w:rPr>
-        <w:t xml:space="preserve">[Programme]</w:t>
-      </w:r>
-      <w:r>
-        <w:t xml:space="preserve">, is a record of original work carried out by us under the supervision of Dr. Priyadarshini Gupta.</w:t>
+        <w:t xml:space="preserve">, submitted to Amity Institute of Information Technology, Amity University Patna, in partial fulfilment of the requirements for the degree of Bachelor of Science in Information Technology (B.Sc. IT), is a record of original work carried out by me under the supervision of Dr. Priyadarshini Gupta.</w:t>
       </w:r>
     </w:p>
     <w:p>
@@ -322,451 +261,49 @@
         <w:jc w:val="both"/>
       </w:pPr>
       <w:r>
-        <w:t xml:space="preserve">The software described in this report was designed, built and tested by the project team. Published standards, laws and libraries used in the work are acknowledged in the References. This report has not been submitted, in part or in full, to any other university or institution for the award of any degree or diploma.</w:t>
+        <w:t xml:space="preserve">The software described in this report was designed, built and tested by me. Published standards, laws and libraries used in the work are acknowledged in the References, and the software tools used, including an AI coding assistant, in the Acknowledgement. This report has not been submitted, in part or in full, to any other university or institution for the award of any degree or diploma.</w:t>
       </w:r>
     </w:p>
     <w:p/>
     <w:p/>
-    <w:tbl>
-      <w:tblPr>
-        <w:tblW w:type="dxa" w:w="9026"/>
-        <w:tblBorders>
-          <w:top w:val="single" w:color="auto" w:sz="4"/>
-          <w:left w:val="single" w:color="auto" w:sz="4"/>
-          <w:bottom w:val="single" w:color="auto" w:sz="4"/>
-          <w:right w:val="single" w:color="auto" w:sz="4"/>
-          <w:insideH w:val="single" w:color="auto" w:sz="4"/>
-          <w:insideV w:val="single" w:color="auto" w:sz="4"/>
-        </w:tblBorders>
-        <w:tblLayout w:type="fixed"/>
-      </w:tblPr>
-      <w:tblGrid>
-        <w:gridCol w:w="3600"/>
-        <w:gridCol w:w="3000"/>
-        <w:gridCol w:w="2426"/>
-      </w:tblGrid>
-      <w:tr>
-        <w:trPr>
-          <w:tblHeader/>
-        </w:trPr>
-        <w:tc>
-          <w:tcPr>
-            <w:tcW w:type="dxa" w:w="3600"/>
-            <w:tcBorders>
-              <w:top w:val="single" w:color="808080" w:sz="4"/>
-              <w:left w:val="single" w:color="808080" w:sz="4"/>
-              <w:bottom w:val="single" w:color="808080" w:sz="4"/>
-              <w:right w:val="single" w:color="808080" w:sz="4"/>
-            </w:tcBorders>
-            <w:shd w:fill="D9E2B6" w:color="auto" w:val="clear"/>
-            <w:tcMar>
-              <w:top w:type="dxa" w:w="60"/>
-              <w:left w:type="dxa" w:w="100"/>
-              <w:bottom w:type="dxa" w:w="60"/>
-              <w:right w:type="dxa" w:w="100"/>
-            </w:tcMar>
-            <w:vAlign w:val="center"/>
-          </w:tcPr>
-          <w:p>
-            <w:r>
-              <w:rPr>
-                <w:b/>
-                <w:bCs/>
-                <w:sz w:val="20"/>
-                <w:szCs w:val="20"/>
-              </w:rPr>
-              <w:t xml:space="preserve">Name</w:t>
-            </w:r>
-          </w:p>
-        </w:tc>
-        <w:tc>
-          <w:tcPr>
-            <w:tcW w:type="dxa" w:w="3000"/>
-            <w:tcBorders>
-              <w:top w:val="single" w:color="808080" w:sz="4"/>
-              <w:left w:val="single" w:color="808080" w:sz="4"/>
-              <w:bottom w:val="single" w:color="808080" w:sz="4"/>
-              <w:right w:val="single" w:color="808080" w:sz="4"/>
-            </w:tcBorders>
-            <w:shd w:fill="D9E2B6" w:color="auto" w:val="clear"/>
-            <w:tcMar>
-              <w:top w:type="dxa" w:w="60"/>
-              <w:left w:type="dxa" w:w="100"/>
-              <w:bottom w:type="dxa" w:w="60"/>
-              <w:right w:type="dxa" w:w="100"/>
-            </w:tcMar>
-            <w:vAlign w:val="center"/>
-          </w:tcPr>
-          <w:p>
-            <w:r>
-              <w:rPr>
-                <w:b/>
-                <w:bCs/>
-                <w:sz w:val="20"/>
-                <w:szCs w:val="20"/>
-              </w:rPr>
-              <w:t xml:space="preserve">Enrolment number</w:t>
-            </w:r>
-          </w:p>
-        </w:tc>
-        <w:tc>
-          <w:tcPr>
-            <w:tcW w:type="dxa" w:w="2426"/>
-            <w:tcBorders>
-              <w:top w:val="single" w:color="808080" w:sz="4"/>
-              <w:left w:val="single" w:color="808080" w:sz="4"/>
-              <w:bottom w:val="single" w:color="808080" w:sz="4"/>
-              <w:right w:val="single" w:color="808080" w:sz="4"/>
-            </w:tcBorders>
-            <w:shd w:fill="D9E2B6" w:color="auto" w:val="clear"/>
-            <w:tcMar>
-              <w:top w:type="dxa" w:w="60"/>
-              <w:left w:type="dxa" w:w="100"/>
-              <w:bottom w:type="dxa" w:w="60"/>
-              <w:right w:type="dxa" w:w="100"/>
-            </w:tcMar>
-            <w:vAlign w:val="center"/>
-          </w:tcPr>
-          <w:p>
-            <w:r>
-              <w:rPr>
-                <w:b/>
-                <w:bCs/>
-                <w:sz w:val="20"/>
-                <w:szCs w:val="20"/>
-              </w:rPr>
-              <w:t xml:space="preserve">Signature</w:t>
-            </w:r>
-          </w:p>
-        </w:tc>
-      </w:tr>
-      <w:tr>
-        <w:tc>
-          <w:tcPr>
-            <w:tcW w:type="dxa" w:w="3600"/>
-            <w:tcBorders>
-              <w:top w:val="single" w:color="808080" w:sz="4"/>
-              <w:left w:val="single" w:color="808080" w:sz="4"/>
-              <w:bottom w:val="single" w:color="808080" w:sz="4"/>
-              <w:right w:val="single" w:color="808080" w:sz="4"/>
-            </w:tcBorders>
-            <w:tcMar>
-              <w:top w:type="dxa" w:w="60"/>
-              <w:left w:type="dxa" w:w="100"/>
-              <w:bottom w:type="dxa" w:w="60"/>
-              <w:right w:type="dxa" w:w="100"/>
-            </w:tcMar>
-            <w:vAlign w:val="center"/>
-          </w:tcPr>
-          <w:p>
-            <w:r>
-              <w:rPr>
-                <w:sz w:val="20"/>
-                <w:szCs w:val="20"/>
-                <w:highlight w:val="yellow"/>
-              </w:rPr>
-              <w:t xml:space="preserve">[Student 1]</w:t>
-            </w:r>
-          </w:p>
-        </w:tc>
-        <w:tc>
-          <w:tcPr>
-            <w:tcW w:type="dxa" w:w="3000"/>
-            <w:tcBorders>
-              <w:top w:val="single" w:color="808080" w:sz="4"/>
-              <w:left w:val="single" w:color="808080" w:sz="4"/>
-              <w:bottom w:val="single" w:color="808080" w:sz="4"/>
-              <w:right w:val="single" w:color="808080" w:sz="4"/>
-            </w:tcBorders>
-            <w:tcMar>
-              <w:top w:type="dxa" w:w="60"/>
-              <w:left w:type="dxa" w:w="100"/>
-              <w:bottom w:type="dxa" w:w="60"/>
-              <w:right w:type="dxa" w:w="100"/>
-            </w:tcMar>
-            <w:vAlign w:val="center"/>
-          </w:tcPr>
-          <w:p>
-            <w:r>
-              <w:rPr>
-                <w:sz w:val="20"/>
-                <w:szCs w:val="20"/>
-                <w:highlight w:val="yellow"/>
-              </w:rPr>
-              <w:t xml:space="preserve">[Enrolment no.]</w:t>
-            </w:r>
-          </w:p>
-        </w:tc>
-        <w:tc>
-          <w:tcPr>
-            <w:tcW w:type="dxa" w:w="2426"/>
-            <w:tcBorders>
-              <w:top w:val="single" w:color="808080" w:sz="4"/>
-              <w:left w:val="single" w:color="808080" w:sz="4"/>
-              <w:bottom w:val="single" w:color="808080" w:sz="4"/>
-              <w:right w:val="single" w:color="808080" w:sz="4"/>
-            </w:tcBorders>
-            <w:tcMar>
-              <w:top w:type="dxa" w:w="60"/>
-              <w:left w:type="dxa" w:w="100"/>
-              <w:bottom w:type="dxa" w:w="60"/>
-              <w:right w:type="dxa" w:w="100"/>
-            </w:tcMar>
-            <w:vAlign w:val="center"/>
-          </w:tcPr>
-          <w:p/>
-        </w:tc>
-      </w:tr>
-      <w:tr>
-        <w:tc>
-          <w:tcPr>
-            <w:tcW w:type="dxa" w:w="3600"/>
-            <w:tcBorders>
-              <w:top w:val="single" w:color="808080" w:sz="4"/>
-              <w:left w:val="single" w:color="808080" w:sz="4"/>
-              <w:bottom w:val="single" w:color="808080" w:sz="4"/>
-              <w:right w:val="single" w:color="808080" w:sz="4"/>
-            </w:tcBorders>
-            <w:tcMar>
-              <w:top w:type="dxa" w:w="60"/>
-              <w:left w:type="dxa" w:w="100"/>
-              <w:bottom w:type="dxa" w:w="60"/>
-              <w:right w:type="dxa" w:w="100"/>
-            </w:tcMar>
-            <w:vAlign w:val="center"/>
-          </w:tcPr>
-          <w:p>
-            <w:r>
-              <w:rPr>
-                <w:sz w:val="20"/>
-                <w:szCs w:val="20"/>
-                <w:highlight w:val="yellow"/>
-              </w:rPr>
-              <w:t xml:space="preserve">[Student 2]</w:t>
-            </w:r>
-          </w:p>
-        </w:tc>
-        <w:tc>
-          <w:tcPr>
-            <w:tcW w:type="dxa" w:w="3000"/>
-            <w:tcBorders>
-              <w:top w:val="single" w:color="808080" w:sz="4"/>
-              <w:left w:val="single" w:color="808080" w:sz="4"/>
-              <w:bottom w:val="single" w:color="808080" w:sz="4"/>
-              <w:right w:val="single" w:color="808080" w:sz="4"/>
-            </w:tcBorders>
-            <w:tcMar>
-              <w:top w:type="dxa" w:w="60"/>
-              <w:left w:type="dxa" w:w="100"/>
-              <w:bottom w:type="dxa" w:w="60"/>
-              <w:right w:type="dxa" w:w="100"/>
-            </w:tcMar>
-            <w:vAlign w:val="center"/>
-          </w:tcPr>
-          <w:p>
-            <w:r>
-              <w:rPr>
-                <w:sz w:val="20"/>
-                <w:szCs w:val="20"/>
-                <w:highlight w:val="yellow"/>
-              </w:rPr>
-              <w:t xml:space="preserve">[Enrolment no.]</w:t>
-            </w:r>
-          </w:p>
-        </w:tc>
-        <w:tc>
-          <w:tcPr>
-            <w:tcW w:type="dxa" w:w="2426"/>
-            <w:tcBorders>
-              <w:top w:val="single" w:color="808080" w:sz="4"/>
-              <w:left w:val="single" w:color="808080" w:sz="4"/>
-              <w:bottom w:val="single" w:color="808080" w:sz="4"/>
-              <w:right w:val="single" w:color="808080" w:sz="4"/>
-            </w:tcBorders>
-            <w:tcMar>
-              <w:top w:type="dxa" w:w="60"/>
-              <w:left w:type="dxa" w:w="100"/>
-              <w:bottom w:type="dxa" w:w="60"/>
-              <w:right w:type="dxa" w:w="100"/>
-            </w:tcMar>
-            <w:vAlign w:val="center"/>
-          </w:tcPr>
-          <w:p/>
-        </w:tc>
-      </w:tr>
-      <w:tr>
-        <w:tc>
-          <w:tcPr>
-            <w:tcW w:type="dxa" w:w="3600"/>
-            <w:tcBorders>
-              <w:top w:val="single" w:color="808080" w:sz="4"/>
-              <w:left w:val="single" w:color="808080" w:sz="4"/>
-              <w:bottom w:val="single" w:color="808080" w:sz="4"/>
-              <w:right w:val="single" w:color="808080" w:sz="4"/>
-            </w:tcBorders>
-            <w:tcMar>
-              <w:top w:type="dxa" w:w="60"/>
-              <w:left w:type="dxa" w:w="100"/>
-              <w:bottom w:type="dxa" w:w="60"/>
-              <w:right w:type="dxa" w:w="100"/>
-            </w:tcMar>
-            <w:vAlign w:val="center"/>
-          </w:tcPr>
-          <w:p>
-            <w:r>
-              <w:rPr>
-                <w:sz w:val="20"/>
-                <w:szCs w:val="20"/>
-                <w:highlight w:val="yellow"/>
-              </w:rPr>
-              <w:t xml:space="preserve">[Student 3]</w:t>
-            </w:r>
-          </w:p>
-        </w:tc>
-        <w:tc>
-          <w:tcPr>
-            <w:tcW w:type="dxa" w:w="3000"/>
-            <w:tcBorders>
-              <w:top w:val="single" w:color="808080" w:sz="4"/>
-              <w:left w:val="single" w:color="808080" w:sz="4"/>
-              <w:bottom w:val="single" w:color="808080" w:sz="4"/>
-              <w:right w:val="single" w:color="808080" w:sz="4"/>
-            </w:tcBorders>
-            <w:tcMar>
-              <w:top w:type="dxa" w:w="60"/>
-              <w:left w:type="dxa" w:w="100"/>
-              <w:bottom w:type="dxa" w:w="60"/>
-              <w:right w:type="dxa" w:w="100"/>
-            </w:tcMar>
-            <w:vAlign w:val="center"/>
-          </w:tcPr>
-          <w:p>
-            <w:r>
-              <w:rPr>
-                <w:sz w:val="20"/>
-                <w:szCs w:val="20"/>
-                <w:highlight w:val="yellow"/>
-              </w:rPr>
-              <w:t xml:space="preserve">[Enrolment no.]</w:t>
-            </w:r>
-          </w:p>
-        </w:tc>
-        <w:tc>
-          <w:tcPr>
-            <w:tcW w:type="dxa" w:w="2426"/>
-            <w:tcBorders>
-              <w:top w:val="single" w:color="808080" w:sz="4"/>
-              <w:left w:val="single" w:color="808080" w:sz="4"/>
-              <w:bottom w:val="single" w:color="808080" w:sz="4"/>
-              <w:right w:val="single" w:color="808080" w:sz="4"/>
-            </w:tcBorders>
-            <w:tcMar>
-              <w:top w:type="dxa" w:w="60"/>
-              <w:left w:type="dxa" w:w="100"/>
-              <w:bottom w:type="dxa" w:w="60"/>
-              <w:right w:type="dxa" w:w="100"/>
-            </w:tcMar>
-            <w:vAlign w:val="center"/>
-          </w:tcPr>
-          <w:p/>
-        </w:tc>
-      </w:tr>
-      <w:tr>
-        <w:tc>
-          <w:tcPr>
-            <w:tcW w:type="dxa" w:w="3600"/>
-            <w:tcBorders>
-              <w:top w:val="single" w:color="808080" w:sz="4"/>
-              <w:left w:val="single" w:color="808080" w:sz="4"/>
-              <w:bottom w:val="single" w:color="808080" w:sz="4"/>
-              <w:right w:val="single" w:color="808080" w:sz="4"/>
-            </w:tcBorders>
-            <w:tcMar>
-              <w:top w:type="dxa" w:w="60"/>
-              <w:left w:type="dxa" w:w="100"/>
-              <w:bottom w:type="dxa" w:w="60"/>
-              <w:right w:type="dxa" w:w="100"/>
-            </w:tcMar>
-            <w:vAlign w:val="center"/>
-          </w:tcPr>
-          <w:p>
-            <w:r>
-              <w:rPr>
-                <w:sz w:val="20"/>
-                <w:szCs w:val="20"/>
-                <w:highlight w:val="yellow"/>
-              </w:rPr>
-              <w:t xml:space="preserve">[Student 4]</w:t>
-            </w:r>
-          </w:p>
-        </w:tc>
-        <w:tc>
-          <w:tcPr>
-            <w:tcW w:type="dxa" w:w="3000"/>
-            <w:tcBorders>
-              <w:top w:val="single" w:color="808080" w:sz="4"/>
-              <w:left w:val="single" w:color="808080" w:sz="4"/>
-              <w:bottom w:val="single" w:color="808080" w:sz="4"/>
-              <w:right w:val="single" w:color="808080" w:sz="4"/>
-            </w:tcBorders>
-            <w:tcMar>
-              <w:top w:type="dxa" w:w="60"/>
-              <w:left w:type="dxa" w:w="100"/>
-              <w:bottom w:type="dxa" w:w="60"/>
-              <w:right w:type="dxa" w:w="100"/>
-            </w:tcMar>
-            <w:vAlign w:val="center"/>
-          </w:tcPr>
-          <w:p>
-            <w:r>
-              <w:rPr>
-                <w:sz w:val="20"/>
-                <w:szCs w:val="20"/>
-                <w:highlight w:val="yellow"/>
-              </w:rPr>
-              <w:t xml:space="preserve">[Enrolment no.]</w:t>
-            </w:r>
-          </w:p>
-        </w:tc>
-        <w:tc>
-          <w:tcPr>
-            <w:tcW w:type="dxa" w:w="2426"/>
-            <w:tcBorders>
-              <w:top w:val="single" w:color="808080" w:sz="4"/>
-              <w:left w:val="single" w:color="808080" w:sz="4"/>
-              <w:bottom w:val="single" w:color="808080" w:sz="4"/>
-              <w:right w:val="single" w:color="808080" w:sz="4"/>
-            </w:tcBorders>
-            <w:tcMar>
-              <w:top w:type="dxa" w:w="60"/>
-              <w:left w:type="dxa" w:w="100"/>
-              <w:bottom w:type="dxa" w:w="60"/>
-              <w:right w:type="dxa" w:w="100"/>
-            </w:tcMar>
-            <w:vAlign w:val="center"/>
-          </w:tcPr>
-          <w:p/>
-        </w:tc>
-      </w:tr>
-    </w:tbl>
-    <w:p>
-      <w:pPr>
-        <w:spacing w:after="160"/>
-      </w:pPr>
-    </w:p>
     <w:p>
       <w:pPr>
         <w:spacing w:after="160" w:line="360"/>
         <w:jc w:val="left"/>
       </w:pPr>
       <w:r>
-        <w:t xml:space="preserve">Place: Patna						Date: </w:t>
-      </w:r>
-      <w:r>
-        <w:rPr>
-          <w:highlight w:val="yellow"/>
-        </w:rPr>
-        <w:t xml:space="preserve">[Date of submission]</w:t>
+        <w:rPr>
+          <w:b/>
+          <w:bCs/>
+        </w:rPr>
+        <w:t xml:space="preserve">Anish Raj</w:t>
+      </w:r>
+    </w:p>
+    <w:p>
+      <w:pPr>
+        <w:spacing w:after="160" w:line="360"/>
+        <w:jc w:val="left"/>
+      </w:pPr>
+      <w:r>
+        <w:t xml:space="preserve">Enrolment No. A45304925031</w:t>
+      </w:r>
+    </w:p>
+    <w:p>
+      <w:pPr>
+        <w:spacing w:after="160" w:line="360"/>
+        <w:jc w:val="left"/>
+      </w:pPr>
+      <w:r>
+        <w:t xml:space="preserve">Signature: ____________________</w:t>
+      </w:r>
+    </w:p>
+    <w:p>
+      <w:pPr>
+        <w:spacing w:after="160" w:line="360"/>
+        <w:jc w:val="left"/>
+      </w:pPr>
+      <w:r>
+        <w:t xml:space="preserve">Place: Patna						Date: ____________</w:t>
       </w:r>
     </w:p>
     <w:p>
@@ -794,61 +331,7 @@
         <w:t xml:space="preserve">“LifeTrack Health: A Patient-Owned, Local-First Health Record with Consent-Controlled Sharing”</w:t>
       </w:r>
       <w:r>
-        <w:t xml:space="preserve">, submitted by </w:t>
-      </w:r>
-      <w:r>
-        <w:rPr>
-          <w:highlight w:val="yellow"/>
-        </w:rPr>
-        <w:t xml:space="preserve">[Student 1]</w:t>
-      </w:r>
-      <w:r>
-        <w:t xml:space="preserve">, </w:t>
-      </w:r>
-      <w:r>
-        <w:rPr>
-          <w:highlight w:val="yellow"/>
-        </w:rPr>
-        <w:t xml:space="preserve">[Student 2]</w:t>
-      </w:r>
-      <w:r>
-        <w:t xml:space="preserve">, </w:t>
-      </w:r>
-      <w:r>
-        <w:rPr>
-          <w:highlight w:val="yellow"/>
-        </w:rPr>
-        <w:t xml:space="preserve">[Student 3]</w:t>
-      </w:r>
-      <w:r>
-        <w:t xml:space="preserve"> and </w:t>
-      </w:r>
-      <w:r>
-        <w:rPr>
-          <w:highlight w:val="yellow"/>
-        </w:rPr>
-        <w:t xml:space="preserve">[Student 4]</w:t>
-      </w:r>
-      <w:r>
-        <w:t xml:space="preserve"> in partial fulfilment of the requirements for the degree of </w:t>
-      </w:r>
-      <w:r>
-        <w:rPr>
-          <w:highlight w:val="yellow"/>
-        </w:rPr>
-        <w:t xml:space="preserve">[Programme]</w:t>
-      </w:r>
-      <w:r>
-        <w:t xml:space="preserve"> at Amity Institute of Information Technology, Amity University Patna, is a bona fide record of work carried out by them under my supervision during the academic session </w:t>
-      </w:r>
-      <w:r>
-        <w:rPr>
-          <w:highlight w:val="yellow"/>
-        </w:rPr>
-        <w:t xml:space="preserve">[2025–2028]</w:t>
-      </w:r>
-      <w:r>
-        <w:t xml:space="preserve">.</w:t>
+        <w:t xml:space="preserve">, submitted by Anish Raj (Enrolment No. A45304925031) in partial fulfilment of the requirements for the degree of Bachelor of Science in Information Technology (B.Sc. IT) at Amity Institute of Information Technology, Amity University Patna, is a bona fide record of work carried out under my supervision during the academic session 2025–2028.</w:t>
       </w:r>
     </w:p>
     <w:p>
@@ -883,10 +366,7 @@
         <w:jc w:val="left"/>
       </w:pPr>
       <w:r>
-        <w:rPr>
-          <w:highlight w:val="yellow"/>
-        </w:rPr>
-        <w:t xml:space="preserve">[Designation]</w:t>
+        <w:t xml:space="preserve">Assistant Professor</w:t>
       </w:r>
     </w:p>
     <w:p>
@@ -922,7 +402,7 @@
         <w:jc w:val="both"/>
       </w:pPr>
       <w:r>
-        <w:t xml:space="preserve">We express our sincere gratitude to our supervisor, </w:t>
+        <w:t xml:space="preserve">I express my sincere gratitude to my supervisor, </w:t>
       </w:r>
       <w:r>
         <w:rPr>
@@ -941,7 +421,7 @@
         <w:jc w:val="both"/>
       </w:pPr>
       <w:r>
-        <w:t xml:space="preserve">We thank the Director and faculty of Amity Institute of Information Technology, Amity University Patna, for providing the environment and resources to carry out this work, and our classmates for testing early versions of the apps and reporting what confused them.</w:t>
+        <w:t xml:space="preserve">I thank the Director and faculty of Amity Institute of Information Technology, Amity University Patna, for providing the environment and resources to carry out this work, and my classmates for testing early versions of the apps and reporting what confused them.</w:t>
       </w:r>
     </w:p>
     <w:p>
@@ -950,7 +430,7 @@
         <w:jc w:val="both"/>
       </w:pPr>
       <w:r>
-        <w:t xml:space="preserve">We also acknowledge the open-source communities behind Flutter, Dart, the </w:t>
+        <w:t xml:space="preserve">I also acknowledge the open-source communities behind Flutter, Dart, the </w:t>
       </w:r>
       <w:r>
         <w:rPr>
@@ -970,7 +450,16 @@
         <w:jc w:val="both"/>
       </w:pPr>
       <w:r>
-        <w:t xml:space="preserve">Finally, we thank our families for their patience and support.</w:t>
+        <w:t xml:space="preserve">Parts of the code and of this report were drafted with the help of an AI coding assistant (Claude, by Anthropic). I directed the work, reviewed what it produced, and ran and checked the tests reported here.</w:t>
+      </w:r>
+    </w:p>
+    <w:p>
+      <w:pPr>
+        <w:spacing w:after="160" w:line="360"/>
+        <w:jc w:val="both"/>
+      </w:pPr>
+      <w:r>
+        <w:t xml:space="preserve">Finally, I thank my family for their patience and support.</w:t>
       </w:r>
     </w:p>
     <w:p/>
@@ -981,46 +470,7 @@
         <w:jc w:val="right"/>
       </w:pPr>
       <w:r>
-        <w:rPr>
-          <w:highlight w:val="yellow"/>
-        </w:rPr>
-        <w:t xml:space="preserve">[Student 1]</w:t>
-      </w:r>
-    </w:p>
-    <w:p>
-      <w:pPr>
-        <w:spacing w:after="160" w:line="360"/>
-        <w:jc w:val="right"/>
-      </w:pPr>
-      <w:r>
-        <w:rPr>
-          <w:highlight w:val="yellow"/>
-        </w:rPr>
-        <w:t xml:space="preserve">[Student 2]</w:t>
-      </w:r>
-    </w:p>
-    <w:p>
-      <w:pPr>
-        <w:spacing w:after="160" w:line="360"/>
-        <w:jc w:val="right"/>
-      </w:pPr>
-      <w:r>
-        <w:rPr>
-          <w:highlight w:val="yellow"/>
-        </w:rPr>
-        <w:t xml:space="preserve">[Student 3]</w:t>
-      </w:r>
-    </w:p>
-    <w:p>
-      <w:pPr>
-        <w:spacing w:after="160" w:line="360"/>
-        <w:jc w:val="right"/>
-      </w:pPr>
-      <w:r>
-        <w:rPr>
-          <w:highlight w:val="yellow"/>
-        </w:rPr>
-        <w:t xml:space="preserve">[Student 4]</w:t>
+        <w:t xml:space="preserve">Anish Raj</w:t>
       </w:r>
     </w:p>
     <w:p>
@@ -1139,21 +589,6 @@
         </w:p>
       </w:sdtContent>
     </w:sdt>
-    <w:p>
-      <w:pPr>
-        <w:spacing w:after="160" w:line="360"/>
-        <w:jc w:val="both"/>
-      </w:pPr>
-      <w:r>
-        <w:rPr>
-          <w:i/>
-          <w:iCs/>
-          <w:sz w:val="20"/>
-          <w:szCs w:val="20"/>
-        </w:rPr>
-        <w:t xml:space="preserve">(If page numbers do not appear, right-click the table in Word and choose “Update Field”.)</w:t>
-      </w:r>
-    </w:p>
     <w:p>
       <w:pPr>
         <w:pStyle w:val="Title"/>
@@ -14173,7 +13608,7 @@
         <w:jc w:val="both"/>
       </w:pPr>
       <w:r>
-        <w:t xml:space="preserve">The proposal planned a mobile app, a separate web analytics dashboard and a clinician portal, with a FHIR R4 data model and a synthetic-dataset approach to verifying analytics. During development the team made three deliberate changes:</w:t>
+        <w:t xml:space="preserve">The proposal planned a mobile app, a separate web analytics dashboard and a clinician portal, with a FHIR R4 data model and a synthetic-dataset approach to verifying analytics. During development I made three deliberate changes:</w:t>
       </w:r>
     </w:p>
     <w:p>

</xml_diff>

<commit_message>
Report: plainer wording (fewer em dashes, less bold, no 'not X but Y')
Co-Authored-By: Claude Opus 5.5 <noreply@anthropic.com>
</commit_message>
<xml_diff>
--- a/docs/report/LifeTrack_Health_NTCC_Report.docx
+++ b/docs/report/LifeTrack_Health_NTCC_Report.docx
@@ -488,7 +488,7 @@
         <w:jc w:val="both"/>
       </w:pPr>
       <w:r>
-        <w:t xml:space="preserve">In India a patient’s medical history is usually spread across the clinics, hospitals and laboratories they have visited, with the patient carrying paper reports between them. When the history is not available, investigations are repeated, medicines are duplicated and family patterns are missed — not because of poor clinical judgement but because the data is fragmented. The patient is the only person present at every encounter, yet rarely holds a complete record.</w:t>
+        <w:t xml:space="preserve">In India a patient’s medical history is usually spread across the clinics, hospitals and laboratories they have visited, with the patient carrying paper reports between them. When the history is not available, investigations are repeated, medicines are duplicated and family patterns are missed. The cause is usually scattered data, not poor clinical judgement. The patient is the only person present at every encounter, yet rarely holds a complete record.</w:t>
       </w:r>
     </w:p>
     <w:p>
@@ -497,24 +497,7 @@
         <w:jc w:val="both"/>
       </w:pPr>
       <w:r>
-        <w:rPr>
-          <w:b/>
-          <w:bCs/>
-        </w:rPr>
-        <w:t xml:space="preserve">LifeTrack Health</w:t>
-      </w:r>
-      <w:r>
-        <w:t xml:space="preserve"> is a working prototype of a patient-owned, local-first health record that addresses this problem. It consists of four parts: an Android patient app built in Flutter; </w:t>
-      </w:r>
-      <w:r>
-        <w:rPr>
-          <w:b/>
-          <w:bCs/>
-        </w:rPr>
-        <w:t xml:space="preserve">LifeTrack Clinic</w:t>
-      </w:r>
-      <w:r>
-        <w:t xml:space="preserve">, a doctor app; a small Dart server that acts as a doctor registry, an encrypted relay and a backup store; and a shared protocol package. Records live on the patient’s phone, sealed with AES-256-GCM under a hardware-backed device key. A doctor sees records only after the patient scans the doctor’s registry-verified code and approves a level of access — Summary, All reports, Family illnesses or Home readings — for a chosen time between one hour and two days. The share is encrypted on the phone to that doctor’s device key alone (X25519 with AES-GCM); the server carries it but can never open it. Prescriptions return to the patient signed with the doctor’s Ed25519 key.</w:t>
+        <w:t xml:space="preserve">LifeTrack Health is a working prototype of a patient-owned, local-first health record that addresses this problem. It consists of four parts: an Android patient app built in Flutter; LifeTrack Clinic, a doctor app; a small Dart server that acts as a doctor registry, an encrypted relay and a backup store; and a shared protocol package. Records live on the patient’s phone, sealed with AES-256-GCM under a hardware-backed device key. A doctor sees records only after the patient scans the doctor’s registry-verified code and approves a level of access (Summary, All reports, Family illnesses or Home readings) for a chosen time between one hour and two days. The share is encrypted on the phone to that doctor’s device key alone (X25519 with AES-GCM); the server carries it but can never open it. Prescriptions return to the patient signed with the doctor’s Ed25519 key.</w:t>
       </w:r>
     </w:p>
     <w:p>
@@ -532,17 +515,7 @@
         <w:jc w:val="both"/>
       </w:pPr>
       <w:r>
-        <w:t xml:space="preserve">The system was built in Dart and Flutter (about 21,700 lines of application code) and is verified by </w:t>
-      </w:r>
-      <w:r>
-        <w:rPr>
-          <w:b/>
-          <w:bCs/>
-        </w:rPr>
-        <w:t xml:space="preserve">354 automated tests</w:t>
-      </w:r>
-      <w:r>
-        <w:t xml:space="preserve"> across unit, widget, invariant and end-to-end integration levels, all passing, with a clean static analysis. The invariant tests turn the project’s privacy promises — for example that no screen may claim the server “cannot read” the data, or that no agent may issue itself a grant — into checks that fail the build. The report describes the problem, the related work, the requirements, the architecture and security design, the implementation, the testing and the results, and closes with limitations and future work, notably ABDM/ABHA integration and legal review before any pilot with real patients.</w:t>
+        <w:t xml:space="preserve">The system was built in Dart and Flutter (about 21,700 lines of application code) and is checked by 354 automated tests across unit, widget, invariant and end-to-end integration levels, all passing, with a clean static analysis. The invariant tests turn the project’s privacy promises into checks that fail the build. For example, no screen may claim the server “cannot read” the data, and no agent may issue itself a grant. The report describes the problem, the related work, the requirements, the architecture and security design, the implementation, the testing and the results, and ends with limitations and future work. The largest open items are ABDM/ABHA integration and a legal review before any pilot with real patients.</w:t>
       </w:r>
     </w:p>
     <w:p>
@@ -760,7 +733,7 @@
           <w:sz w:val="22"/>
           <w:szCs w:val="22"/>
         </w:rPr>
-        <w:t xml:space="preserve">Table 3.2  Functional requirements — patient app</w:t>
+        <w:t xml:space="preserve">Table 3.2  Functional requirements: patient app</w:t>
       </w:r>
     </w:p>
     <w:p>
@@ -772,7 +745,7 @@
           <w:sz w:val="22"/>
           <w:szCs w:val="22"/>
         </w:rPr>
-        <w:t xml:space="preserve">Table 3.3  Functional requirements — doctor app and server</w:t>
+        <w:t xml:space="preserve">Table 3.3  Functional requirements: doctor app and server</w:t>
       </w:r>
     </w:p>
     <w:p>
@@ -1190,7 +1163,7 @@
         <w:jc w:val="both"/>
       </w:pPr>
       <w:r>
-        <w:t xml:space="preserve">Health care in India is delivered by a very large number of independent providers: government hospitals, private hospitals, single-doctor clinics, diagnostic laboratories and pharmacies. Each keeps its own records, if it keeps them digitally at all, and very few exchange them. For the patient, the practical result is a carry bag of paper — prescriptions, lab printouts, discharge summaries and scan reports — that is incomplete, easily lost and hard for a new doctor to read in a ten-minute consultation.</w:t>
+        <w:t xml:space="preserve">Health care in India is delivered by a very large number of independent providers: government hospitals, private hospitals, single-doctor clinics, diagnostic laboratories and pharmacies. Each keeps its own records, if it keeps them digitally at all, and very few exchange them. For the patient, the practical result is a carry bag of paper (prescriptions, lab printouts, discharge summaries and scan reports) that is incomplete, easily lost and hard for a new doctor to read in a ten-minute consultation.</w:t>
       </w:r>
     </w:p>
     <w:p>
@@ -1312,7 +1285,7 @@
         <w:jc w:val="both"/>
       </w:pPr>
       <w:r>
-        <w:t xml:space="preserve">Health data is among the most sensitive personal data. A design in which a company’s servers hold readable copies of millions of records creates a single point of failure for breaches, misuse and function creep. A local-first design — where the authoritative copy lives on the patient’s device and leaves it only encrypted, on the patient’s explicit action — reduces that risk by construction. Building such a system end to end, including the cryptography, the consent rules and a doctor-side app, is a demanding software-engineering exercise that touches mobile development, security, distributed systems, user-interface design and law.</w:t>
+        <w:t xml:space="preserve">Health data is among the most sensitive personal data. A design in which a company’s servers hold readable copies of millions of records creates a single point of failure for breaches, misuse and function creep. In a local-first design the main copy lives on the patient’s device and leaves it only encrypted, and only when the patient asks. That removes the central store of readable records. Building such a system end to end, including the cryptography, the consent rules and a doctor-side app, is a large piece of software engineering that touches mobile development, security, distributed systems, user-interface design and law.</w:t>
       </w:r>
     </w:p>
     <w:p>
@@ -1334,17 +1307,7 @@
         <w:jc w:val="both"/>
       </w:pPr>
       <w:r>
-        <w:t xml:space="preserve">Build a </w:t>
-      </w:r>
-      <w:r>
-        <w:rPr>
-          <w:b/>
-          <w:bCs/>
-        </w:rPr>
-        <w:t xml:space="preserve">patient-owned record</w:t>
-      </w:r>
-      <w:r>
-        <w:t xml:space="preserve"> on the phone that holds prescriptions, lab reports, scans, notes, allergies, conditions, vitals and vaccinations for every member of a family, with all data encrypted at rest.</w:t>
+        <w:t xml:space="preserve">Build a patient-owned record on the phone that holds prescriptions, lab reports, scans, notes, allergies, conditions, vitals and vaccinations for every member of a family, with all data encrypted at rest.</w:t>
       </w:r>
     </w:p>
     <w:p>
@@ -1358,17 +1321,7 @@
         <w:jc w:val="both"/>
       </w:pPr>
       <w:r>
-        <w:t xml:space="preserve">Make </w:t>
-      </w:r>
-      <w:r>
-        <w:rPr>
-          <w:b/>
-          <w:bCs/>
-        </w:rPr>
-        <w:t xml:space="preserve">clinician access explicit, time-limited and revocable</w:t>
-      </w:r>
-      <w:r>
-        <w:t xml:space="preserve">: the patient approves a level of access for one verified doctor for a chosen time, and can shorten, extend or end it.</w:t>
+        <w:t xml:space="preserve">Make clinician access explicit, time-limited and revocable: the patient approves a level of access for one verified doctor for a chosen time, and can shorten, extend or end it.</w:t>
       </w:r>
     </w:p>
     <w:p>
@@ -1382,17 +1335,7 @@
         <w:jc w:val="both"/>
       </w:pPr>
       <w:r>
-        <w:t xml:space="preserve">Guarantee that </w:t>
-      </w:r>
-      <w:r>
-        <w:rPr>
-          <w:b/>
-          <w:bCs/>
-        </w:rPr>
-        <w:t xml:space="preserve">no server can read</w:t>
-      </w:r>
-      <w:r>
-        <w:t xml:space="preserve"> shared records or backups: shares are encrypted to the doctor’s device key and backups to a key derived from a password only the patient holds.</w:t>
+        <w:t xml:space="preserve">Make sure no server can read shared records or backups: shares are encrypted to the doctor’s device key and backups to a key derived from a password only the patient holds.</w:t>
       </w:r>
     </w:p>
     <w:p>
@@ -1406,17 +1349,7 @@
         <w:jc w:val="both"/>
       </w:pPr>
       <w:r>
-        <w:t xml:space="preserve">Provide </w:t>
-      </w:r>
-      <w:r>
-        <w:rPr>
-          <w:b/>
-          <w:bCs/>
-        </w:rPr>
-        <w:t xml:space="preserve">useful, safe insights</w:t>
-      </w:r>
-      <w:r>
-        <w:t xml:space="preserve"> on the device: compare results with published reference ranges, notice movement between reports and spot duplicate medicines, without ever stating a diagnosis or a forecast.</w:t>
+        <w:t xml:space="preserve">Provide useful, safe insights on the device: compare results with published reference ranges, notice movement between reports and spot duplicate medicines, without ever stating a diagnosis or a forecast.</w:t>
       </w:r>
     </w:p>
     <w:p>
@@ -1430,17 +1363,7 @@
         <w:jc w:val="both"/>
       </w:pPr>
       <w:r>
-        <w:t xml:space="preserve">Reduce data-entry effort by </w:t>
-      </w:r>
-      <w:r>
-        <w:rPr>
-          <w:b/>
-          <w:bCs/>
-        </w:rPr>
-        <w:t xml:space="preserve">reading photographed and PDF lab reports on the device</w:t>
-      </w:r>
-      <w:r>
-        <w:t xml:space="preserve"> (OCR), with the patient confirming uncertain fields.</w:t>
+        <w:t xml:space="preserve">Reduce typing by reading photographed and PDF lab reports on the device (OCR), with the patient confirming uncertain fields.</w:t>
       </w:r>
     </w:p>
     <w:p>
@@ -1454,17 +1377,7 @@
         <w:jc w:val="both"/>
       </w:pPr>
       <w:r>
-        <w:t xml:space="preserve">Build a </w:t>
-      </w:r>
-      <w:r>
-        <w:rPr>
-          <w:b/>
-          <w:bCs/>
-        </w:rPr>
-        <w:t xml:space="preserve">doctor app</w:t>
-      </w:r>
-      <w:r>
-        <w:t xml:space="preserve"> with a verified identity, so that a patient knows who they are sharing with, and so that prescriptions returned to the patient are signed.</w:t>
+        <w:t xml:space="preserve">Build a doctor app with a verified identity, so that a patient knows who they are sharing with, and so that prescriptions returned to the patient are signed.</w:t>
       </w:r>
     </w:p>
     <w:p>
@@ -1478,17 +1391,7 @@
         <w:jc w:val="both"/>
       </w:pPr>
       <w:r>
-        <w:t xml:space="preserve">Make every privacy promise </w:t>
-      </w:r>
-      <w:r>
-        <w:rPr>
-          <w:b/>
-          <w:bCs/>
-        </w:rPr>
-        <w:t xml:space="preserve">verifiable</w:t>
-      </w:r>
-      <w:r>
-        <w:t xml:space="preserve">: express the system’s rules as automated tests that fail the build when broken.</w:t>
+        <w:t xml:space="preserve">Make every privacy promise verifiable: express the system’s rules as automated tests that fail the build when broken.</w:t>
       </w:r>
     </w:p>
     <w:p>
@@ -2500,7 +2403,7 @@
         <w:jc w:val="both"/>
       </w:pPr>
       <w:r>
-        <w:t xml:space="preserve">The local-first software movement argues that the user’s device should hold the authoritative copy of their data, with the network used for synchronisation and collaboration rather than custody. End-to-end encryption, familiar from messaging, shows that a relay can carry data it cannot read. Clinical-safety guidance for software as a medical device distinguishes between displaying information (low risk) and diagnosing or predicting (regulated). LifeTrack combines these: a local-first record, an end-to-end encrypted relay, and insights that state only position and movement and route the patient to a person.</w:t>
+        <w:t xml:space="preserve">The local-first software movement argues that the user’s device should hold the authoritative copy of their data, with the network used to sync and collaborate, not to hold the data. End-to-end encryption, familiar from messaging, shows that a relay can carry data it cannot read. Clinical-safety guidance for software as a medical device distinguishes between displaying information (low risk) and diagnosing or predicting (regulated). LifeTrack combines these: a local-first record, an end-to-end encrypted relay, and insights that state only position and movement and route the patient to a person.</w:t>
       </w:r>
     </w:p>
     <w:p>
@@ -2517,7 +2420,7 @@
         <w:jc w:val="both"/>
       </w:pPr>
       <w:r>
-        <w:t xml:space="preserve">No widely available system combines (a) a patient-held, encrypted, family-aware record, (b) on-device interpretation of results that is deliberately non-diagnostic, (c) sharing to a registry-verified doctor that the server cannot read, with a time limit the patient sets, and (d) privacy promises enforced by automated tests. LifeTrack Health is a prototype of that combination.</w:t>
+        <w:t xml:space="preserve">I could not find a widely available system that combines (a) a patient-held, encrypted, family-aware record, (b) on-device interpretation of results that is deliberately non-diagnostic, (c) sharing to a registry-verified doctor that the server cannot read, with a time limit the patient sets, and (d) privacy promises enforced by automated tests. LifeTrack Health is a prototype of that combination.</w:t>
       </w:r>
     </w:p>
     <w:p>
@@ -2950,7 +2853,7 @@
           <w:sz w:val="20"/>
           <w:szCs w:val="20"/>
         </w:rPr>
-        <w:t xml:space="preserve">Table 3.2: Functional requirements — patient app</w:t>
+        <w:t xml:space="preserve">Table 3.2: Functional requirements: patient app</w:t>
       </w:r>
     </w:p>
     <w:tbl>
@@ -3958,7 +3861,7 @@
           <w:sz w:val="20"/>
           <w:szCs w:val="20"/>
         </w:rPr>
-        <w:t xml:space="preserve">Table 3.3: Functional requirements — doctor app and server</w:t>
+        <w:t xml:space="preserve">Table 3.3: Functional requirements: doctor app and server</w:t>
       </w:r>
     </w:p>
     <w:tbl>
@@ -5438,7 +5341,7 @@
                 <w:sz w:val="20"/>
                 <w:szCs w:val="20"/>
               </w:rPr>
-              <w:t xml:space="preserve">—</w:t>
+              <w:t xml:space="preserve">Same</w:t>
             </w:r>
           </w:p>
         </w:tc>
@@ -5521,7 +5424,7 @@
                 <w:sz w:val="20"/>
                 <w:szCs w:val="20"/>
               </w:rPr>
-              <w:t xml:space="preserve">—</w:t>
+              <w:t xml:space="preserve">Same</w:t>
             </w:r>
           </w:p>
         </w:tc>
@@ -5604,7 +5507,7 @@
                 <w:sz w:val="20"/>
                 <w:szCs w:val="20"/>
               </w:rPr>
-              <w:t xml:space="preserve">—</w:t>
+              <w:t xml:space="preserve">Not needed</w:t>
             </w:r>
           </w:p>
         </w:tc>
@@ -5687,7 +5590,7 @@
                 <w:sz w:val="20"/>
                 <w:szCs w:val="20"/>
               </w:rPr>
-              <w:t xml:space="preserve">—</w:t>
+              <w:t xml:space="preserve">Bundled in the apps</w:t>
             </w:r>
           </w:p>
         </w:tc>
@@ -5724,7 +5627,7 @@
         <w:t xml:space="preserve">Technical.</w:t>
       </w:r>
       <w:r>
-        <w:t xml:space="preserve"> Flutter and Dart provide mature cryptography, camera, QR and notification support; Tesseract runs fully on-device. The prototype demonstrates every required flow end to end.</w:t>
+        <w:t xml:space="preserve"> Flutter and Dart provide mature cryptography, camera, QR and notification support; Tesseract runs fully on-device. Every required flow works end to end in the prototype.</w:t>
       </w:r>
     </w:p>
     <w:p>
@@ -5813,47 +5716,7 @@
         <w:jc w:val="both"/>
       </w:pPr>
       <w:r>
-        <w:t xml:space="preserve">LifeTrack Health has four parts (Figure 4.1). The </w:t>
-      </w:r>
-      <w:r>
-        <w:rPr>
-          <w:b/>
-          <w:bCs/>
-        </w:rPr>
-        <w:t xml:space="preserve">patient app</w:t>
-      </w:r>
-      <w:r>
-        <w:t xml:space="preserve"> is the custodian of the record. The </w:t>
-      </w:r>
-      <w:r>
-        <w:rPr>
-          <w:b/>
-          <w:bCs/>
-        </w:rPr>
-        <w:t xml:space="preserve">doctor app</w:t>
-      </w:r>
-      <w:r>
-        <w:t xml:space="preserve">, LifeTrack Clinic, is the only other place records can be read, and only while a share is open. The </w:t>
-      </w:r>
-      <w:r>
-        <w:rPr>
-          <w:b/>
-          <w:bCs/>
-        </w:rPr>
-        <w:t xml:space="preserve">server</w:t>
-      </w:r>
-      <w:r>
-        <w:t xml:space="preserve"> is deliberately small and untrusted with content: it signs doctor certificates, carries sealed messages, maps LifeTrack IDs to mailboxes, stores encrypted backups and runs the identity-check flow. A shared Dart package, </w:t>
-      </w:r>
-      <w:r>
-        <w:rPr>
-          <w:b/>
-          <w:bCs/>
-        </w:rPr>
-        <w:t xml:space="preserve">lifetrack_protocol</w:t>
-      </w:r>
-      <w:r>
-        <w:t xml:space="preserve">, defines the message formats, certificates and ID rules used by all three, so that the apps and the server cannot drift apart.</w:t>
+        <w:t xml:space="preserve">LifeTrack Health has four parts (Figure 4.1). The patient app holds the record. The doctor app, LifeTrack Clinic, is the only other place records can be read, and only while a share is open. The server is kept small and is never trusted with readable content: it signs doctor certificates, carries sealed messages, maps LifeTrack IDs to mailboxes, stores encrypted backups and runs the identity-check flow. A shared Dart package, lifetrack_protocol, defines the message formats, certificates and ID rules used by all three, so that the apps and the server cannot drift apart.</w:t>
       </w:r>
     </w:p>
     <w:p>
@@ -5923,7 +5786,7 @@
         <w:pStyle w:val="Heading2"/>
       </w:pPr>
       <w:r>
-        <w:t xml:space="preserve">4.2 Data flow — Level 0</w:t>
+        <w:t xml:space="preserve">4.2 Data flow (Level 0)</w:t>
       </w:r>
     </w:p>
     <w:p>
@@ -6011,67 +5874,7 @@
         <w:jc w:val="both"/>
       </w:pPr>
       <w:r>
-        <w:t xml:space="preserve">Inside the patient app (Figure 4.3), screens never touch storage or compare values with ranges themselves. They call </w:t>
-      </w:r>
-      <w:r>
-        <w:rPr>
-          <w:b/>
-          <w:bCs/>
-        </w:rPr>
-        <w:t xml:space="preserve">AppServices</w:t>
-      </w:r>
-      <w:r>
-        <w:t xml:space="preserve">, the single entry point, and render </w:t>
-      </w:r>
-      <w:r>
-        <w:rPr>
-          <w:b/>
-          <w:bCs/>
-        </w:rPr>
-        <w:t xml:space="preserve">Insight</w:t>
-      </w:r>
-      <w:r>
-        <w:t xml:space="preserve"> objects. Any reader other than the patient — on-device insights, a share, the disabled cloud plane — must go through </w:t>
-      </w:r>
-      <w:r>
-        <w:rPr>
-          <w:b/>
-          <w:bCs/>
-        </w:rPr>
-        <w:t xml:space="preserve">RecordAccess</w:t>
-      </w:r>
-      <w:r>
-        <w:t xml:space="preserve">, which asks </w:t>
-      </w:r>
-      <w:r>
-        <w:rPr>
-          <w:b/>
-          <w:bCs/>
-        </w:rPr>
-        <w:t xml:space="preserve">ConsentStore</w:t>
-      </w:r>
-      <w:r>
-        <w:t xml:space="preserve"> whether a stored grant allows the read and writes an audit entry for every read and every refusal. Below that, </w:t>
-      </w:r>
-      <w:r>
-        <w:rPr>
-          <w:b/>
-          <w:bCs/>
-        </w:rPr>
-        <w:t xml:space="preserve">SealedStore</w:t>
-      </w:r>
-      <w:r>
-        <w:t xml:space="preserve"> encrypts every blob and </w:t>
-      </w:r>
-      <w:r>
-        <w:rPr>
-          <w:b/>
-          <w:bCs/>
-        </w:rPr>
-        <w:t xml:space="preserve">FileByteStore</w:t>
-      </w:r>
-      <w:r>
-        <w:t xml:space="preserve"> writes it atomically (write to a temporary file, flush, rename).</w:t>
+        <w:t xml:space="preserve">Inside the patient app (Figure 4.3), screens never touch storage or compare values with ranges themselves. They call AppServices, the single entry point, and render Insight objects. Any reader other than the patient (on-device insights, a share, the disabled cloud plane) must go through RecordAccess, which asks ConsentStore whether a stored grant allows the read and writes an audit entry for every read and every refusal. Below that, SealedStore encrypts every blob and FileByteStore writes it atomically (write to a temporary file, flush, rename).</w:t>
       </w:r>
     </w:p>
     <w:p>
@@ -6159,10 +5962,10 @@
           <w:b/>
           <w:bCs/>
         </w:rPr>
-        <w:t xml:space="preserve">Plane A — on-device insights (Tier 1).</w:t>
-      </w:r>
-      <w:r>
-        <w:t xml:space="preserve"> Deterministic rules that state where a value sits relative to a published range, whether it moved meaningfully since the last report, and whether two prescriptions share an ingredient. It reads records only under its own actor and a 24-hour grant the patient turns on, and it is forbidden from calling the clock directly so that its output is reproducible in tests.</w:t>
+        <w:t xml:space="preserve">Plane A: on-device insights (Tier 1).</w:t>
+      </w:r>
+      <w:r>
+        <w:t xml:space="preserve"> Fixed rules that state where a value sits relative to a published range, whether it moved meaningfully since the last report, and whether two prescriptions share an ingredient. It reads records only under its own actor and a 24-hour grant the patient turns on, and it is forbidden from calling the clock directly so that its output is reproducible in tests.</w:t>
       </w:r>
     </w:p>
     <w:p>
@@ -6180,7 +5983,7 @@
           <w:b/>
           <w:bCs/>
         </w:rPr>
-        <w:t xml:space="preserve">Plane B — capture.</w:t>
+        <w:t xml:space="preserve">Plane B: capture.</w:t>
       </w:r>
       <w:r>
         <w:t xml:space="preserve"> Turns a photographed or PDF page into a draft record using Tesseract OCR on the phone. Fields read with low confidence must be ticked or corrected before one final confirmation.</w:t>
@@ -6201,7 +6004,7 @@
           <w:b/>
           <w:bCs/>
         </w:rPr>
-        <w:t xml:space="preserve">Plane C — cloud analysis (Tier 2).</w:t>
+        <w:t xml:space="preserve">Plane C: cloud analysis (Tier 2).</w:t>
       </w:r>
       <w:r>
         <w:t xml:space="preserve"> Designed but switched off. It can only cross on a fresh human tap bound to the disclosure the patient read, with its own one-time grant. It stays dark until a certified service exists.</w:t>
@@ -6221,17 +6024,7 @@
         <w:jc w:val="both"/>
       </w:pPr>
       <w:r>
-        <w:t xml:space="preserve">A grant (consent token) records the patient, who granted it (the patient, or a parent or custodian for a dependent), the grantee, the purpose, the level and filter, the validity window, and whether it is revoked or spent. Authorisation always resolves the </w:t>
-      </w:r>
-      <w:r>
-        <w:rPr>
-          <w:b/>
-          <w:bCs/>
-        </w:rPr>
-        <w:t xml:space="preserve">stored</w:t>
-      </w:r>
-      <w:r>
-        <w:t xml:space="preserve"> grant by id and re-checks every field; a token presented by a caller is never trusted on its own. Further rules:</w:t>
+        <w:t xml:space="preserve">A grant (consent token) records the patient, who granted it (the patient, or a parent or custodian for a dependent), the grantee, the purpose, the level and filter, the validity window, and whether it is revoked or spent. Authorisation always looks up the stored grant by id and re-checks every field; a token presented by a caller is never trusted on its own. Further rules:</w:t>
       </w:r>
     </w:p>
     <w:p>
@@ -6287,17 +6080,7 @@
         <w:jc w:val="both"/>
       </w:pPr>
       <w:r>
-        <w:t xml:space="preserve">Proxy consent applies only to dependents: a parent for a child under 18 (sharing stops at 18), or a custodian for an adult who delegated in person. One function, </w:t>
-      </w:r>
-      <w:r>
-        <w:rPr>
-          <w:b/>
-          <w:bCs/>
-        </w:rPr>
-        <w:t xml:space="preserve">actingGrantor()</w:t>
-      </w:r>
-      <w:r>
-        <w:t xml:space="preserve">, makes that decision for every share.</w:t>
+        <w:t xml:space="preserve">Proxy consent applies only to dependents: a parent for a child under 18 (sharing stops at 18), or a custodian for an adult who delegated in person. One function, actingGrantor(), makes that decision for every share.</w:t>
       </w:r>
     </w:p>
     <w:p>
@@ -6449,7 +6232,7 @@
                 <w:sz w:val="20"/>
                 <w:szCs w:val="20"/>
               </w:rPr>
-              <w:t xml:space="preserve">Allergies, conditions, active medicines and the latest result for each test — the level that prevents repeat tests</w:t>
+              <w:t xml:space="preserve">Allergies, conditions, active medicines and the latest result for each test; the level aimed at preventing repeat tests</w:t>
             </w:r>
           </w:p>
         </w:tc>
@@ -6642,87 +6425,7 @@
         <w:jc w:val="both"/>
       </w:pPr>
       <w:r>
-        <w:t xml:space="preserve">The main entities are </w:t>
-      </w:r>
-      <w:r>
-        <w:rPr>
-          <w:b/>
-          <w:bCs/>
-        </w:rPr>
-        <w:t xml:space="preserve">Patient</w:t>
-      </w:r>
-      <w:r>
-        <w:t xml:space="preserve"> (profile, date of birth, sex, ABHA, role), </w:t>
-      </w:r>
-      <w:r>
-        <w:rPr>
-          <w:b/>
-          <w:bCs/>
-        </w:rPr>
-        <w:t xml:space="preserve">Custody</w:t>
-      </w:r>
-      <w:r>
-        <w:t xml:space="preserve"> (who may consent for whom, and the family role), </w:t>
-      </w:r>
-      <w:r>
-        <w:rPr>
-          <w:b/>
-          <w:bCs/>
-        </w:rPr>
-        <w:t xml:space="preserve">HealthRecord</w:t>
-      </w:r>
-      <w:r>
-        <w:t xml:space="preserve"> (kind: prescription, report, scan or note; source: typed by patient, smart capture, doctor-issued, restored, lab-signed; provenance badge; test results with the lab’s printed range; medicines with status), </w:t>
-      </w:r>
-      <w:r>
-        <w:rPr>
-          <w:b/>
-          <w:bCs/>
-        </w:rPr>
-        <w:t xml:space="preserve">ClinicalProfile</w:t>
-      </w:r>
-      <w:r>
-        <w:t xml:space="preserve"> (allergies, conditions, family illnesses), </w:t>
-      </w:r>
-      <w:r>
-        <w:rPr>
-          <w:b/>
-          <w:bCs/>
-        </w:rPr>
-        <w:t xml:space="preserve">VitalReading</w:t>
-      </w:r>
-      <w:r>
-        <w:t xml:space="preserve">, </w:t>
-      </w:r>
-      <w:r>
-        <w:rPr>
-          <w:b/>
-          <w:bCs/>
-        </w:rPr>
-        <w:t xml:space="preserve">EmergencyCard</w:t>
-      </w:r>
-      <w:r>
-        <w:t xml:space="preserve"> (fixed, bounded fields), </w:t>
-      </w:r>
-      <w:r>
-        <w:rPr>
-          <w:b/>
-          <w:bCs/>
-        </w:rPr>
-        <w:t xml:space="preserve">ConsentToken</w:t>
-      </w:r>
-      <w:r>
-        <w:t xml:space="preserve">, and </w:t>
-      </w:r>
-      <w:r>
-        <w:rPr>
-          <w:b/>
-          <w:bCs/>
-        </w:rPr>
-        <w:t xml:space="preserve">AuditEntry</w:t>
-      </w:r>
-      <w:r>
-        <w:t xml:space="preserve">. Every record keeps where it came from, because a doctor will reuse a result instead of re-ordering the test only if it can be traced to a laboratory. Results show their age and never “valid” or “expired”.</w:t>
+        <w:t xml:space="preserve">The main entities are Patient (profile, date of birth, sex, ABHA, role), Custody (who may consent for whom, and the family role), HealthRecord (kind: prescription, report, scan or note; source: typed by patient, smart capture, doctor-issued, restored, lab-signed; provenance badge; test results with the lab’s printed range; medicines with status), ClinicalProfile (allergies, conditions, family illnesses), VitalReading, EmergencyCard (fixed, bounded fields), ConsentToken, and AuditEntry. Every record keeps where it came from, because a doctor will reuse a result instead of re-ordering the test only if it can be traced to a laboratory. Results show their age and never “valid” or “expired”.</w:t>
       </w:r>
     </w:p>
     <w:p>
@@ -6857,17 +6560,7 @@
         <w:jc w:val="both"/>
       </w:pPr>
       <w:r>
-        <w:t xml:space="preserve">A password chosen by people is the weakest link in any encrypted backup, so LifeTrack </w:t>
-      </w:r>
-      <w:r>
-        <w:rPr>
-          <w:b/>
-          <w:bCs/>
-        </w:rPr>
-        <w:t xml:space="preserve">generates</w:t>
-      </w:r>
-      <w:r>
-        <w:t xml:space="preserve"> the password: 20 characters, about 100 bits of entropy, shown once with an account code and recovery codes. Figure 4.5 shows the key hierarchy. Argon2id stretches the password; HKDF derives a vault key and a login verifier. The vault key wraps a random data key, which encrypts the backup. The data key is also split into three Shamir shares, any two of which recover it. The server keeps only a hash of the verifier and rate-limits wrong proofs to ten per hour, a limit that survives restarts.</w:t>
+        <w:t xml:space="preserve">A password chosen by people is the weakest link in any encrypted backup, so LifeTrack generates the password: 20 characters, about 100 bits of entropy, shown once with an account code and recovery codes. Figure 4.5 shows the key hierarchy. Argon2id stretches the password; HKDF derives a vault key and a login verifier. The vault key wraps a random data key, which encrypts the backup. The data key is also split into three Shamir shares, any two of which recover it. The server keeps only a hash of the verifier and rate-limits wrong proofs to ten per hour, a limit that survives restarts.</w:t>
       </w:r>
     </w:p>
     <w:p>
@@ -7091,17 +6784,7 @@
         <w:t xml:space="preserve">XXXX XXXX XXXX</w:t>
       </w:r>
       <w:r>
-        <w:t xml:space="preserve">. The last digit is a </w:t>
-      </w:r>
-      <w:r>
-        <w:rPr>
-          <w:b/>
-          <w:bCs/>
-        </w:rPr>
-        <w:t xml:space="preserve">Verhoeff</w:t>
-      </w:r>
-      <w:r>
-        <w:t xml:space="preserve"> check digit, which catches every single-digit error and every swap of neighbouring digits. IDs always start with 1, so they can never be confused with an Aadhaar number. The server maps an ID only to a reply mailbox and key — no name, no records — and only the token held on the phone can move or delete it.</w:t>
+        <w:t xml:space="preserve">. The last digit is a Verhoeff check digit, which catches every single-digit error and every swap of neighbouring digits. IDs always start with 1, so they can never be confused with an Aadhaar number. The server maps an ID only to a reply mailbox and key. It holds no name and no records, and only the token held on the phone can move or delete it.</w:t>
       </w:r>
     </w:p>
     <w:p>
@@ -8763,187 +8446,7 @@
         <w:t xml:space="preserve">app/lib/src/</w:t>
       </w:r>
       <w:r>
-        <w:t xml:space="preserve">: </w:t>
-      </w:r>
-      <w:r>
-        <w:rPr>
-          <w:b/>
-          <w:bCs/>
-        </w:rPr>
-        <w:t xml:space="preserve">ai</w:t>
-      </w:r>
-      <w:r>
-        <w:t xml:space="preserve"> (planes A, B, C and the Insight contract), </w:t>
-      </w:r>
-      <w:r>
-        <w:rPr>
-          <w:b/>
-          <w:bCs/>
-        </w:rPr>
-        <w:t xml:space="preserve">app</w:t>
-      </w:r>
-      <w:r>
-        <w:t xml:space="preserve"> (AppServices and wiring), </w:t>
-      </w:r>
-      <w:r>
-        <w:rPr>
-          <w:b/>
-          <w:bCs/>
-        </w:rPr>
-        <w:t xml:space="preserve">audit</w:t>
-      </w:r>
-      <w:r>
-        <w:t xml:space="preserve">, </w:t>
-      </w:r>
-      <w:r>
-        <w:rPr>
-          <w:b/>
-          <w:bCs/>
-        </w:rPr>
-        <w:t xml:space="preserve">capture</w:t>
-      </w:r>
-      <w:r>
-        <w:t xml:space="preserve"> (OCR and image handling), </w:t>
-      </w:r>
-      <w:r>
-        <w:rPr>
-          <w:b/>
-          <w:bCs/>
-        </w:rPr>
-        <w:t xml:space="preserve">consent</w:t>
-      </w:r>
-      <w:r>
-        <w:t xml:space="preserve">, </w:t>
-      </w:r>
-      <w:r>
-        <w:rPr>
-          <w:b/>
-          <w:bCs/>
-        </w:rPr>
-        <w:t xml:space="preserve">crypto</w:t>
-      </w:r>
-      <w:r>
-        <w:t xml:space="preserve">, </w:t>
-      </w:r>
-      <w:r>
-        <w:rPr>
-          <w:b/>
-          <w:bCs/>
-        </w:rPr>
-        <w:t xml:space="preserve">emergency</w:t>
-      </w:r>
-      <w:r>
-        <w:t xml:space="preserve">, </w:t>
-      </w:r>
-      <w:r>
-        <w:rPr>
-          <w:b/>
-          <w:bCs/>
-        </w:rPr>
-        <w:t xml:space="preserve">export</w:t>
-      </w:r>
-      <w:r>
-        <w:t xml:space="preserve">, </w:t>
-      </w:r>
-      <w:r>
-        <w:rPr>
-          <w:b/>
-          <w:bCs/>
-        </w:rPr>
-        <w:t xml:space="preserve">family</w:t>
-      </w:r>
-      <w:r>
-        <w:t xml:space="preserve">, </w:t>
-      </w:r>
-      <w:r>
-        <w:rPr>
-          <w:b/>
-          <w:bCs/>
-        </w:rPr>
-        <w:t xml:space="preserve">identity</w:t>
-      </w:r>
-      <w:r>
-        <w:t xml:space="preserve">, </w:t>
-      </w:r>
-      <w:r>
-        <w:rPr>
-          <w:b/>
-          <w:bCs/>
-        </w:rPr>
-        <w:t xml:space="preserve">model</w:t>
-      </w:r>
-      <w:r>
-        <w:t xml:space="preserve">, </w:t>
-      </w:r>
-      <w:r>
-        <w:rPr>
-          <w:b/>
-          <w:bCs/>
-        </w:rPr>
-        <w:t xml:space="preserve">reminders</w:t>
-      </w:r>
-      <w:r>
-        <w:t xml:space="preserve">, </w:t>
-      </w:r>
-      <w:r>
-        <w:rPr>
-          <w:b/>
-          <w:bCs/>
-        </w:rPr>
-        <w:t xml:space="preserve">security</w:t>
-      </w:r>
-      <w:r>
-        <w:t xml:space="preserve">, </w:t>
-      </w:r>
-      <w:r>
-        <w:rPr>
-          <w:b/>
-          <w:bCs/>
-        </w:rPr>
-        <w:t xml:space="preserve">share</w:t>
-      </w:r>
-      <w:r>
-        <w:t xml:space="preserve">, </w:t>
-      </w:r>
-      <w:r>
-        <w:rPr>
-          <w:b/>
-          <w:bCs/>
-        </w:rPr>
-        <w:t xml:space="preserve">storage</w:t>
-      </w:r>
-      <w:r>
-        <w:t xml:space="preserve">, </w:t>
-      </w:r>
-      <w:r>
-        <w:rPr>
-          <w:b/>
-          <w:bCs/>
-        </w:rPr>
-        <w:t xml:space="preserve">ui</w:t>
-      </w:r>
-      <w:r>
-        <w:t xml:space="preserve">, </w:t>
-      </w:r>
-      <w:r>
-        <w:rPr>
-          <w:b/>
-          <w:bCs/>
-        </w:rPr>
-        <w:t xml:space="preserve">vaccines</w:t>
-      </w:r>
-      <w:r>
-        <w:t xml:space="preserve"> and </w:t>
-      </w:r>
-      <w:r>
-        <w:rPr>
-          <w:b/>
-          <w:bCs/>
-        </w:rPr>
-        <w:t xml:space="preserve">vault</w:t>
-      </w:r>
-      <w:r>
-        <w:t xml:space="preserve">.</w:t>
+        <w:t xml:space="preserve">: ai (planes A, B, C and the Insight contract), app (AppServices and wiring), audit, capture (OCR and image handling), consent, crypto, emergency, export, family, identity, model, reminders, security, share, storage, ui, vaccines and vault.</w:t>
       </w:r>
     </w:p>
     <w:p>
@@ -8960,7 +8463,7 @@
         <w:jc w:val="both"/>
       </w:pPr>
       <w:r>
-        <w:t xml:space="preserve">The app has five tabs — Reminders, Records, Insights, Share and Me — and a family bar at the top for switching between profiles (Figure 5.1).</w:t>
+        <w:t xml:space="preserve">The app has five tabs (Reminders, Records, Insights, Share and Me) and a family bar at the top for switching between profiles (Figure 5.1).</w:t>
       </w:r>
     </w:p>
     <w:p>
@@ -9335,7 +8838,7 @@
         <w:jc w:val="both"/>
       </w:pPr>
       <w:r>
-        <w:t xml:space="preserve">A page arrives from the camera, the photo library, a PDF or another app’s share sheet. The image is straightened, resized and stripped of metadata, then passed to Tesseract in the Android activity. A parser recognises test names, values, units and printed ranges. Any field read with confidence below 0.85 — and every handwritten field — must be ticked or corrected before the patient confirms that the draft matches the report. The original image is kept, encrypted, with the record.</w:t>
+        <w:t xml:space="preserve">A page arrives from the camera, the photo library, a PDF or another app’s share sheet. The image is straightened, resized and stripped of metadata, then passed to Tesseract in the Android activity. A parser recognises test names, values, units and printed ranges. Any field read with confidence below 0.85, and every handwritten field, must be ticked or corrected before the patient confirms that the draft matches the report. The original image is kept, encrypted, with the record.</w:t>
       </w:r>
     </w:p>
     <w:p>
@@ -9369,17 +8872,7 @@
         <w:jc w:val="both"/>
       </w:pPr>
       <w:r>
-        <w:t xml:space="preserve">The phone owner is the head of the family. Each other profile has a role describing who the person is to the head. A child under 18 can be added only as the head’s son or daughter, with consent declared by the parent; sharing for that child stops at 18. An adult may delegate to a custodian in person, and can end it. Adults with their own phones can be </w:t>
-      </w:r>
-      <w:r>
-        <w:rPr>
-          <w:b/>
-          <w:bCs/>
-        </w:rPr>
-        <w:t xml:space="preserve">linked</w:t>
-      </w:r>
-      <w:r>
-        <w:t xml:space="preserve">: each may share their Emergency ID and/or current medicine list with the other — both off by default — sealed to the other phone’s key via the relay, with a safety code shown on both phones.</w:t>
+        <w:t xml:space="preserve">The phone owner is the head of the family. Each other profile has a role describing who the person is to the head. A child under 18 can be added only as the head’s son or daughter, with consent declared by the parent; sharing for that child stops at 18. An adult may delegate to a custodian in person, and can end it. Adults with their own phones can be linked. Each may share their Emergency ID and/or current medicine list with the other (both are off by default), sealed to the other phone’s key via the relay, with a safety code shown on both phones.</w:t>
       </w:r>
     </w:p>
     <w:p>
@@ -9404,7 +8897,7 @@
         <w:pStyle w:val="Heading2"/>
       </w:pPr>
       <w:r>
-        <w:t xml:space="preserve">5.4 Doctor app — LifeTrack Clinic</w:t>
+        <w:t xml:space="preserve">5.4 Doctor app: LifeTrack Clinic</w:t>
       </w:r>
     </w:p>
     <w:p>
@@ -9484,7 +8977,7 @@
         <w:jc w:val="both"/>
       </w:pPr>
       <w:r>
-        <w:t xml:space="preserve">Opening a share shows the patient’s allergies prominently, current and past medicines with their status, conditions and the latest tests with their source and age, and a link to the original report image. Beside it, the doctor writes a prescription — medicine, active ingredient, morning-afternoon-night dose, timing relative to food, duration and a note — and signs and sends it (Figure 5.4). The prescription can also be printed with the registration number and a signature fingerprint. The doctor app keeps its own notes and a patient register, sealed in the browser.</w:t>
+        <w:t xml:space="preserve">Opening a share shows the patient’s allergies prominently, current and past medicines with their status, conditions and the latest tests with their source and age, and a link to the original report image. Beside it, the doctor writes a prescription with the medicine, active ingredient, morning-afternoon-night dose, timing relative to food, duration and a note, then signs and sends it (Figure 5.4). The prescription can also be printed with the registration number and a signature fingerprint. The doctor app keeps its own notes and a patient register, sealed in the browser.</w:t>
       </w:r>
     </w:p>
     <w:p>
@@ -10155,7 +9648,7 @@
         <w:t xml:space="preserve">Versioning rule.</w:t>
       </w:r>
       <w:r>
-        <w:t xml:space="preserve"> Every update raises the version — a feature raises the middle number, a fix the last — and adds a line to the changelog in the same commit. At the time of writing the patient app is at 1.19.0 and the doctor app at 1.8.0 (Appendix A).</w:t>
+        <w:t xml:space="preserve"> Every update raises the version (a feature raises the middle number, a fix the last) and adds a line to the changelog in the same commit. At the time of writing the patient app is at 1.19.0 and the doctor app at 1.8.0 (Appendix A).</w:t>
       </w:r>
     </w:p>
     <w:p>
@@ -10223,17 +9716,7 @@
         <w:jc w:val="both"/>
       </w:pPr>
       <w:r>
-        <w:t xml:space="preserve">Testing followed one principle from the project proposal: </w:t>
-      </w:r>
-      <w:r>
-        <w:rPr>
-          <w:b/>
-          <w:bCs/>
-        </w:rPr>
-        <w:t xml:space="preserve">a claim is accepted only if a test can prove it</w:t>
-      </w:r>
-      <w:r>
-        <w:t xml:space="preserve">. Five kinds of tests were written:</w:t>
+        <w:t xml:space="preserve">Testing followed one principle from the project proposal: a claim is accepted only if a test can prove it. Five kinds of tests were written:</w:t>
       </w:r>
     </w:p>
     <w:p>
@@ -10296,7 +9779,7 @@
         <w:t xml:space="preserve">Invariant tests</w:t>
       </w:r>
       <w:r>
-        <w:t xml:space="preserve"> that read the source code itself and fail the build if a rule is broken — for example, if any file other than the one network file becomes socket-capable, if the release manifest gains the INTERNET permission without review, if code under </w:t>
+        <w:t xml:space="preserve"> that read the source code itself and fail the build if a rule is broken. Examples: any file other than the one network file becomes socket-capable, the release manifest gaining the INTERNET permission without review, code under </w:t>
       </w:r>
       <w:r>
         <w:rPr>
@@ -10307,7 +9790,7 @@
         <w:t xml:space="preserve">lib/src/ai/</w:t>
       </w:r>
       <w:r>
-        <w:t xml:space="preserve"> calls </w:t>
+        <w:t xml:space="preserve"> calling </w:t>
       </w:r>
       <w:r>
         <w:rPr>
@@ -10329,7 +9812,7 @@
         <w:t xml:space="preserve">DateTime.now()</w:t>
       </w:r>
       <w:r>
-        <w:t xml:space="preserve">, or if any UI string claims that LifeTrack or the server “cannot read” the patient’s data. These tests strip comments first, so a comment cannot hide or fake a violation.</w:t>
+        <w:t xml:space="preserve">, or any UI string claiming that LifeTrack or the server “cannot read” the patient’s data. These tests strip comments first, so a comment cannot hide or fake a violation.</w:t>
       </w:r>
     </w:p>
     <w:p>
@@ -13608,7 +13091,7 @@
         <w:jc w:val="both"/>
       </w:pPr>
       <w:r>
-        <w:t xml:space="preserve">The proposal planned a mobile app, a separate web analytics dashboard and a clinician portal, with a FHIR R4 data model and a synthetic-dataset approach to verifying analytics. During development I made three deliberate changes:</w:t>
+        <w:t xml:space="preserve">The proposal planned a mobile app, a separate web analytics dashboard and a clinician portal, with a FHIR R4 data model and a synthetic-dataset approach to verifying analytics. During development I changed three things from the proposal:</w:t>
       </w:r>
     </w:p>
     <w:p>
@@ -13680,7 +13163,7 @@
         <w:jc w:val="both"/>
       </w:pPr>
       <w:r>
-        <w:t xml:space="preserve">The proposal’s “ground-truth” principle was kept and widened: rather than one synthetic dataset, every rule the system promises is written as a test with a known expected result.</w:t>
+        <w:t xml:space="preserve">The proposal’s “ground-truth” principle was kept and widened. Instead of one synthetic dataset, every rule the system promises is written as a test with a known expected result.</w:t>
       </w:r>
     </w:p>
     <w:p>
@@ -13697,7 +13180,7 @@
         <w:jc w:val="both"/>
       </w:pPr>
       <w:r>
-        <w:t xml:space="preserve">The main lesson of the project is that privacy has to be designed into the structure of the code, not added as a feature. Making ConsentStore the only grant authority and RecordAccess the only non-patient read path meant that sharing, insights and the cloud plane all inherited the same checks and the same audit trail. Expressing the rules as source-scanning tests turned code review questions (“does anything else open a socket?”) into automatic answers.</w:t>
+        <w:t xml:space="preserve">The main lesson of the project is that privacy has to be built into the structure of the code from the start. Adding it later as a feature does not work. Making ConsentStore the only grant authority and RecordAccess the only non-patient read path meant that sharing, insights and the cloud plane all inherited the same checks and the same audit trail. Expressing the rules as source-scanning tests turned code review questions (“does anything else open a socket?”) into automatic answers.</w:t>
       </w:r>
     </w:p>
     <w:p>
@@ -13715,7 +13198,7 @@
         <w:jc w:val="both"/>
       </w:pPr>
       <w:r>
-        <w:t xml:space="preserve">Finally, the work on provenance showed that what lets a doctor reuse a result instead of ordering it again is not access control alone but trust in where the result came from — the laboratory, the sample date, the printed range and the original image. These are shown on every result.</w:t>
+        <w:t xml:space="preserve">Finally, the work on provenance showed that a doctor will reuse a result instead of ordering it again only if they trust where it came from. Access control alone is not enough; the doctor needs the laboratory, the sample date, the printed range and the original image. These are shown on every result.</w:t>
       </w:r>
     </w:p>
     <w:p>
@@ -13741,7 +13224,7 @@
         <w:jc w:val="both"/>
       </w:pPr>
       <w:r>
-        <w:t xml:space="preserve">LifeTrack Health demonstrates that a patient can hold a complete, useful health record on their own phone and share exactly the right part of it with a verified doctor for a limited time, while the server that carries the data can never read it. The prototype covers the full loop — capture, understanding, sharing, prescribing back, reminders, emergencies, family, backup and export — across a patient app, a doctor app and a server, and every privacy and safety promise it makes is checked by an automated test. All 354 tests pass and static analysis is clean.</w:t>
+        <w:t xml:space="preserve">LifeTrack Health shows that a patient can hold a complete, useful health record on their own phone and share exactly the right part of it with a verified doctor for a limited time, while the server that carries the data can never read it. The prototype covers the full loop (capture, understanding, sharing, prescribing back, reminders, emergencies, family, backup and export) across a patient app, a doctor app and a server, and every privacy and safety promise it makes is checked by an automated test. All 354 tests pass and static analysis is clean.</w:t>
       </w:r>
     </w:p>
     <w:p>
@@ -13865,14 +13348,7 @@
         <w:jc w:val="both"/>
       </w:pPr>
       <w:r>
-        <w:rPr>
-          <w:b/>
-          <w:bCs/>
-        </w:rPr>
-        <w:t xml:space="preserve">ABDM / ABHA integration</w:t>
-      </w:r>
-      <w:r>
-        <w:t xml:space="preserve">: verify ABHA, link records as a health information user, and map ABDM consent artefacts as a separate long-lived type.</w:t>
+        <w:t xml:space="preserve">ABDM / ABHA integration: verify ABHA, link records as a health information user, and map ABDM consent artefacts as a separate long-lived type.</w:t>
       </w:r>
     </w:p>
     <w:p>
@@ -13886,14 +13362,7 @@
         <w:jc w:val="both"/>
       </w:pPr>
       <w:r>
-        <w:rPr>
-          <w:b/>
-          <w:bCs/>
-        </w:rPr>
-        <w:t xml:space="preserve">DigiLocker partner registration</w:t>
-      </w:r>
-      <w:r>
-        <w:t xml:space="preserve"> to replace the practice stand-in.</w:t>
+        <w:t xml:space="preserve">DigiLocker partner registration to replace the practice stand-in.</w:t>
       </w:r>
     </w:p>
     <w:p>
@@ -13907,14 +13376,7 @@
         <w:jc w:val="both"/>
       </w:pPr>
       <w:r>
-        <w:rPr>
-          <w:b/>
-          <w:bCs/>
-        </w:rPr>
-        <w:t xml:space="preserve">FHIR R4 export</w:t>
-      </w:r>
-      <w:r>
-        <w:t xml:space="preserve"> of records with Provenance resources.</w:t>
+        <w:t xml:space="preserve">FHIR R4 export of records with Provenance resources.</w:t>
       </w:r>
     </w:p>
     <w:p>
@@ -13928,14 +13390,7 @@
         <w:jc w:val="both"/>
       </w:pPr>
       <w:r>
-        <w:rPr>
-          <w:b/>
-          <w:bCs/>
-        </w:rPr>
-        <w:t xml:space="preserve">Hosted deployment</w:t>
-      </w:r>
-      <w:r>
-        <w:t xml:space="preserve"> of the server behind a reverse proxy, with push notifications instead of polling.</w:t>
+        <w:t xml:space="preserve">Hosted deployment of the server behind a reverse proxy, with push notifications instead of polling.</w:t>
       </w:r>
     </w:p>
     <w:p>
@@ -13949,14 +13404,7 @@
         <w:jc w:val="both"/>
       </w:pPr>
       <w:r>
-        <w:rPr>
-          <w:b/>
-          <w:bCs/>
-        </w:rPr>
-        <w:t xml:space="preserve">iOS support</w:t>
-      </w:r>
-      <w:r>
-        <w:t xml:space="preserve">, including on-device OCR with Apple Vision.</w:t>
+        <w:t xml:space="preserve">iOS support, including on-device OCR with Apple Vision.</w:t>
       </w:r>
     </w:p>
     <w:p>
@@ -13970,14 +13418,7 @@
         <w:jc w:val="both"/>
       </w:pPr>
       <w:r>
-        <w:rPr>
-          <w:b/>
-          <w:bCs/>
-        </w:rPr>
-        <w:t xml:space="preserve">OCR accuracy study</w:t>
-      </w:r>
-      <w:r>
-        <w:t xml:space="preserve"> on real photographed reports from Indian laboratories.</w:t>
+        <w:t xml:space="preserve">OCR accuracy study on real photographed reports from Indian laboratories.</w:t>
       </w:r>
     </w:p>
     <w:p>
@@ -13991,14 +13432,7 @@
         <w:jc w:val="both"/>
       </w:pPr>
       <w:r>
-        <w:rPr>
-          <w:b/>
-          <w:bCs/>
-        </w:rPr>
-        <w:t xml:space="preserve">Relative-contributed family history</w:t>
-      </w:r>
-      <w:r>
-        <w:t xml:space="preserve">, with that relative’s own consent per request.</w:t>
+        <w:t xml:space="preserve">Relative-contributed family history, with that relative’s own consent per request.</w:t>
       </w:r>
     </w:p>
     <w:p>
@@ -14012,14 +13446,7 @@
         <w:jc w:val="both"/>
       </w:pPr>
       <w:r>
-        <w:rPr>
-          <w:b/>
-          <w:bCs/>
-        </w:rPr>
-        <w:t xml:space="preserve">Plane C (Tier 2)</w:t>
-      </w:r>
-      <w:r>
-        <w:t xml:space="preserve"> cloud analysis, only with a certified service and the human-tap safeguards already designed.</w:t>
+        <w:t xml:space="preserve">Plane C (Tier 2) cloud analysis, only with a certified service and the human-tap safeguards already designed.</w:t>
       </w:r>
     </w:p>
     <w:p>
@@ -14033,14 +13460,7 @@
         <w:jc w:val="both"/>
       </w:pPr>
       <w:r>
-        <w:rPr>
-          <w:b/>
-          <w:bCs/>
-        </w:rPr>
-        <w:t xml:space="preserve">Pilot</w:t>
-      </w:r>
-      <w:r>
-        <w:t xml:space="preserve"> with a partner clinic and laboratory after legal and clinical review.</w:t>
+        <w:t xml:space="preserve">Pilot with a partner clinic and laboratory after legal and clinical review.</w:t>
       </w:r>
     </w:p>
     <w:p>
@@ -14229,7 +13649,7 @@
           <w:i w:val="false"/>
           <w:iCs w:val="false"/>
         </w:rPr>
-        <w:t xml:space="preserve"> — ABHA and Health Information Exchange &amp; Consent Manager specifications. https://abdm.gov.in</w:t>
+        <w:t xml:space="preserve">: ABHA and Health Information Exchange &amp; Consent Manager specifications. https://abdm.gov.in</w:t>
       </w:r>
     </w:p>
     <w:p>
@@ -14259,7 +13679,7 @@
           <w:i w:val="false"/>
           <w:iCs w:val="false"/>
         </w:rPr>
-        <w:t xml:space="preserve"> — National Immunization Schedule.</w:t>
+        <w:t xml:space="preserve">: National Immunization Schedule.</w:t>
       </w:r>
     </w:p>
     <w:p>

</xml_diff>

<commit_message>
Report: author's voice and active sentences throughout (human skill pass)
Co-Authored-By: Claude Opus 5.5 <noreply@anthropic.com>
</commit_message>
<xml_diff>
--- a/docs/report/LifeTrack_Health_NTCC_Report.docx
+++ b/docs/report/LifeTrack_Health_NTCC_Report.docx
@@ -497,7 +497,7 @@
         <w:jc w:val="both"/>
       </w:pPr>
       <w:r>
-        <w:t xml:space="preserve">LifeTrack Health is a working prototype of a patient-owned, local-first health record that addresses this problem. It consists of four parts: an Android patient app built in Flutter; LifeTrack Clinic, a doctor app; a small Dart server that acts as a doctor registry, an encrypted relay and a backup store; and a shared protocol package. Records live on the patient’s phone, sealed with AES-256-GCM under a hardware-backed device key. A doctor sees records only after the patient scans the doctor’s registry-verified code and approves a level of access (Summary, All reports, Family illnesses or Home readings) for a chosen time between one hour and two days. The share is encrypted on the phone to that doctor’s device key alone (X25519 with AES-GCM); the server carries it but can never open it. Prescriptions return to the patient signed with the doctor’s Ed25519 key.</w:t>
+        <w:t xml:space="preserve">LifeTrack Health is a working prototype I built to change that: a health record that the patient owns and that lives on their own phone. It has four parts: an Android patient app built in Flutter; LifeTrack Clinic, a doctor app; a small Dart server that acts as a doctor registry, an encrypted relay and a backup store; and a shared protocol package. Records live on the patient’s phone, sealed with AES-256-GCM under a hardware-backed device key. A doctor sees records only after the patient scans the doctor’s registry-verified code and approves a level of access (Summary, All reports, Family illnesses or Home readings) for a chosen time between one hour and two days. The share is encrypted on the phone to that doctor’s device key alone (X25519 with AES-GCM); the server carries it but can never open it. Prescriptions return to the patient signed with the doctor’s Ed25519 key.</w:t>
       </w:r>
     </w:p>
     <w:p>
@@ -515,7 +515,7 @@
         <w:jc w:val="both"/>
       </w:pPr>
       <w:r>
-        <w:t xml:space="preserve">The system was built in Dart and Flutter (about 21,700 lines of application code) and is checked by 354 automated tests across unit, widget, invariant and end-to-end integration levels, all passing, with a clean static analysis. The invariant tests turn the project’s privacy promises into checks that fail the build. For example, no screen may claim the server “cannot read” the data, and no agent may issue itself a grant. The report describes the problem, the related work, the requirements, the architecture and security design, the implementation, the testing and the results, and ends with limitations and future work. The largest open items are ABDM/ABHA integration and a legal review before any pilot with real patients.</w:t>
+        <w:t xml:space="preserve">I wrote the system in Dart and Flutter (about 21,700 lines of application code). It has 354 automated tests at unit, widget, invariant and end-to-end integration level, and all of them pass with a clean static analysis. The invariant tests turn the project’s privacy promises into checks that fail the build: no screen may claim the server “cannot read” the data, for example, and no agent may issue itself a grant. The biggest pieces of work still open are ABDM/ABHA integration and a legal review before any pilot with real patients.</w:t>
       </w:r>
     </w:p>
     <w:p>
@@ -1163,7 +1163,7 @@
         <w:jc w:val="both"/>
       </w:pPr>
       <w:r>
-        <w:t xml:space="preserve">Health care in India is delivered by a very large number of independent providers: government hospitals, private hospitals, single-doctor clinics, diagnostic laboratories and pharmacies. Each keeps its own records, if it keeps them digitally at all, and very few exchange them. For the patient, the practical result is a carry bag of paper (prescriptions, lab printouts, discharge summaries and scan reports) that is incomplete, easily lost and hard for a new doctor to read in a ten-minute consultation.</w:t>
+        <w:t xml:space="preserve">In India, health care comes from a very large number of independent providers: government hospitals, private hospitals, single-doctor clinics, diagnostic laboratories and pharmacies. Each keeps its own records, if it keeps them digitally at all, and very few exchange them. For the patient, the practical result is a carry bag of paper (prescriptions, lab printouts, discharge summaries and scan reports) that is incomplete, easily lost and hard for a new doctor to read in a ten-minute consultation.</w:t>
       </w:r>
     </w:p>
     <w:p>
@@ -1285,7 +1285,7 @@
         <w:jc w:val="both"/>
       </w:pPr>
       <w:r>
-        <w:t xml:space="preserve">Health data is among the most sensitive personal data. A design in which a company’s servers hold readable copies of millions of records creates a single point of failure for breaches, misuse and function creep. In a local-first design the main copy lives on the patient’s device and leaves it only encrypted, and only when the patient asks. That removes the central store of readable records. Building such a system end to end, including the cryptography, the consent rules and a doctor-side app, is a large piece of software engineering that touches mobile development, security, distributed systems, user-interface design and law.</w:t>
+        <w:t xml:space="preserve">Health data is among the most sensitive personal data. A design in which a company’s servers hold readable copies of millions of records creates a single point of failure for breaches, misuse and function creep. In a local-first design the main copy lives on the patient’s device and leaves it only encrypted, and only when the patient asks. That removes the central store of readable records. I chose this project because building such a system end to end, with the cryptography, the consent rules and a doctor-side app, meant working across mobile development, security, distributed systems, user-interface design and law.</w:t>
       </w:r>
     </w:p>
     <w:p>
@@ -6560,7 +6560,7 @@
         <w:jc w:val="both"/>
       </w:pPr>
       <w:r>
-        <w:t xml:space="preserve">A password chosen by people is the weakest link in any encrypted backup, so LifeTrack generates the password: 20 characters, about 100 bits of entropy, shown once with an account code and recovery codes. Figure 4.5 shows the key hierarchy. Argon2id stretches the password; HKDF derives a vault key and a login verifier. The vault key wraps a random data key, which encrypts the backup. The data key is also split into three Shamir shares, any two of which recover it. The server keeps only a hash of the verifier and rate-limits wrong proofs to ten per hour, a limit that survives restarts.</w:t>
+        <w:t xml:space="preserve">People tend to choose weak passwords, and in an encrypted backup the password is the weakest link. So LifeTrack generates the password itself: 20 characters, about 100 bits of entropy, shown once with an account code and recovery codes. Figure 4.5 shows the key hierarchy. Argon2id stretches the password; HKDF derives a vault key and a login verifier. The vault key wraps a random data key, which encrypts the backup. The data key is also split into three Shamir shares, any two of which recover it. The server keeps only a hash of the verifier and rate-limits wrong proofs to ten per hour, a limit that survives restarts.</w:t>
       </w:r>
     </w:p>
     <w:p>
@@ -9690,7 +9690,7 @@
         <w:t xml:space="preserve">Release build.</w:t>
       </w:r>
       <w:r>
-        <w:t xml:space="preserve"> The APK is built obfuscated by a script; the symbol map stays on the developer machine.</w:t>
+        <w:t xml:space="preserve"> A script builds an obfuscated APK; the symbol map stays on my development machine.</w:t>
       </w:r>
     </w:p>
     <w:p>
@@ -9716,7 +9716,7 @@
         <w:jc w:val="both"/>
       </w:pPr>
       <w:r>
-        <w:t xml:space="preserve">Testing followed one principle from the project proposal: a claim is accepted only if a test can prove it. Five kinds of tests were written:</w:t>
+        <w:t xml:space="preserve">Testing followed one principle from the project proposal: a claim is accepted only if a test can prove it. I wrote five kinds of tests:</w:t>
       </w:r>
     </w:p>
     <w:p>
@@ -9779,7 +9779,7 @@
         <w:t xml:space="preserve">Invariant tests</w:t>
       </w:r>
       <w:r>
-        <w:t xml:space="preserve"> that read the source code itself and fail the build if a rule is broken. Examples: any file other than the one network file becomes socket-capable, the release manifest gaining the INTERNET permission without review, code under </w:t>
+        <w:t xml:space="preserve"> that read the source code itself and fail the build if a rule is broken. For example, the build fails if any file other than the one network file can open a socket, if the release manifest gains the INTERNET permission without review, if code under </w:t>
       </w:r>
       <w:r>
         <w:rPr>
@@ -9790,7 +9790,7 @@
         <w:t xml:space="preserve">lib/src/ai/</w:t>
       </w:r>
       <w:r>
-        <w:t xml:space="preserve"> calling </w:t>
+        <w:t xml:space="preserve"> calls </w:t>
       </w:r>
       <w:r>
         <w:rPr>
@@ -9812,7 +9812,7 @@
         <w:t xml:space="preserve">DateTime.now()</w:t>
       </w:r>
       <w:r>
-        <w:t xml:space="preserve">, or any UI string claiming that LifeTrack or the server “cannot read” the patient’s data. These tests strip comments first, so a comment cannot hide or fake a violation.</w:t>
+        <w:t xml:space="preserve">, or if any UI string claims that LifeTrack or the server “cannot read” the patient’s data. These tests strip comments first, so a comment cannot hide or fake a violation.</w:t>
       </w:r>
     </w:p>
     <w:p>
@@ -9871,7 +9871,7 @@
         <w:jc w:val="both"/>
       </w:pPr>
       <w:r>
-        <w:t xml:space="preserve">All tests were run on 5 October 2026 on the current version (patient app 1.19.0, doctor app 1.8.0). Static analysis (</w:t>
+        <w:t xml:space="preserve">I ran all the tests on 5 October 2026 on the current version (patient app 1.19.0, doctor app 1.8.0). Static analysis (</w:t>
       </w:r>
       <w:r>
         <w:rPr>
@@ -12561,7 +12561,7 @@
         <w:jc w:val="both"/>
       </w:pPr>
       <w:r>
-        <w:t xml:space="preserve">The release APK was installed on an Android phone (Samsung Galaxy S25) connected to the local server over USB. The share, request-by-ID, prescription and backup flows were exercised by hand, and a medicine reminder was confirmed to fire on the device with names hidden on the lock screen. OCR accuracy has so far been tested mainly on synthetic report images; testing on a wider set of real photographed reports is listed as future work.</w:t>
+        <w:t xml:space="preserve">I installed the release APK on an Android phone (Samsung Galaxy S25) connected to the local server over USB, and went through the share, request-by-ID, prescription and backup flows by hand. A medicine reminder fired on the phone with the medicine names hidden on the lock screen, as designed. So far I have tested OCR mainly on synthetic report images. Testing it on a wider set of real photographed reports is future work.</w:t>
       </w:r>
     </w:p>
     <w:p>
@@ -13112,7 +13112,7 @@
         <w:t xml:space="preserve">Analytics moved onto the phone.</w:t>
       </w:r>
       <w:r>
-        <w:t xml:space="preserve"> A web dashboard would need a server that can read records, which contradicts the project’s central promise. The analytics were instead built into the patient app as on-device insights.</w:t>
+        <w:t xml:space="preserve"> A web dashboard would need a server that can read records, which goes against the project’s central promise. I built the analytics into the patient app instead, as on-device insights.</w:t>
       </w:r>
     </w:p>
     <w:p>
@@ -13133,7 +13133,7 @@
         <w:t xml:space="preserve">The clinician portal became LifeTrack Clinic</w:t>
       </w:r>
       <w:r>
-        <w:t xml:space="preserve">, a full doctor app with verified identity, request by ID and signed prescriptions, because safe sharing proved to be the most valuable feature for reducing repeat tests.</w:t>
+        <w:t xml:space="preserve">, a full doctor app with verified identity, request by ID and signed prescriptions, because safe sharing turned out to be the most useful feature for reducing repeat tests.</w:t>
       </w:r>
     </w:p>
     <w:p>
@@ -13163,7 +13163,7 @@
         <w:jc w:val="both"/>
       </w:pPr>
       <w:r>
-        <w:t xml:space="preserve">The proposal’s “ground-truth” principle was kept and widened. Instead of one synthetic dataset, every rule the system promises is written as a test with a known expected result.</w:t>
+        <w:t xml:space="preserve">I kept the proposal’s “ground-truth” principle and widened it. Instead of one synthetic dataset, every rule the system promises is written as a test with a known expected result.</w:t>
       </w:r>
     </w:p>
     <w:p>
@@ -13180,7 +13180,7 @@
         <w:jc w:val="both"/>
       </w:pPr>
       <w:r>
-        <w:t xml:space="preserve">The main lesson of the project is that privacy has to be built into the structure of the code from the start. Adding it later as a feature does not work. Making ConsentStore the only grant authority and RecordAccess the only non-patient read path meant that sharing, insights and the cloud plane all inherited the same checks and the same audit trail. Expressing the rules as source-scanning tests turned code review questions (“does anything else open a socket?”) into automatic answers.</w:t>
+        <w:t xml:space="preserve">The main thing I learned is that privacy has to be part of the structure of the code from the start. It cannot be added later as a feature. Making ConsentStore the only grant authority and RecordAccess the only non-patient read path meant that sharing, insights and the cloud plane all inherited the same checks and the same audit trail. Expressing the rules as source-scanning tests turned code review questions (“does anything else open a socket?”) into automatic answers.</w:t>
       </w:r>
     </w:p>
     <w:p>
@@ -13189,7 +13189,7 @@
         <w:jc w:val="both"/>
       </w:pPr>
       <w:r>
-        <w:t xml:space="preserve">A second lesson is that honest wording is a requirement. Early screens said the doctor “keeps no copy” and that the server “cannot read” the data. Both were withdrawn: a doctor is legally required to keep their consultation record, and an offline password-guessing attack on a human-chosen password would make “cannot read” untrue. The app now generates the password and the UI makes only claims the code can back, enforced by a test.</w:t>
+        <w:t xml:space="preserve">The second lesson is that honest wording is a requirement too. Early screens said the doctor “keeps no copy” and that the server “cannot read” the data. I removed both claims: a doctor is legally required to keep their consultation record, and an offline password-guessing attack on a human-chosen password would make “cannot read” untrue. The app now generates the password and the UI makes only claims the code can back, enforced by a test.</w:t>
       </w:r>
     </w:p>
     <w:p>
@@ -13198,7 +13198,7 @@
         <w:jc w:val="both"/>
       </w:pPr>
       <w:r>
-        <w:t xml:space="preserve">Finally, the work on provenance showed that a doctor will reuse a result instead of ordering it again only if they trust where it came from. Access control alone is not enough; the doctor needs the laboratory, the sample date, the printed range and the original image. These are shown on every result.</w:t>
+        <w:t xml:space="preserve">Finally, working on provenance showed me that a doctor will reuse a result instead of ordering it again only if they trust where it came from. Access control alone is not enough; the doctor needs the laboratory, the sample date, the printed range and the original image. These are shown on every result.</w:t>
       </w:r>
     </w:p>
     <w:p>
@@ -13246,7 +13246,7 @@
         <w:jc w:val="both"/>
       </w:pPr>
       <w:r>
-        <w:t xml:space="preserve">Only synthetic patients and doctors have been used; no real patient data.</w:t>
+        <w:t xml:space="preserve">I have used only synthetic patients and doctors, never real patient data.</w:t>
       </w:r>
     </w:p>
     <w:p>

</xml_diff>

<commit_message>
Report: reword passages closest to published text; add in-text citations [1]-[21]
Co-Authored-By: Claude Opus 5.5 <noreply@anthropic.com>
</commit_message>
<xml_diff>
--- a/docs/report/LifeTrack_Health_NTCC_Report.docx
+++ b/docs/report/LifeTrack_Health_NTCC_Report.docx
@@ -2438,10 +2438,10 @@
           <w:b/>
           <w:bCs/>
         </w:rPr>
-        <w:t xml:space="preserve">HL7 FHIR R4.</w:t>
-      </w:r>
-      <w:r>
-        <w:t xml:space="preserve"> The widely adopted standard for exchanging health data as resources (Patient, Observation, MedicationRequest, Provenance). ABDM uses FHIR-based profiles. LifeTrack’s record model keeps provenance and source on every record so that a later FHIR export can say where each value came from; FHIR export itself is future work (Section 8.3).</w:t>
+        <w:t xml:space="preserve">HL7 FHIR R4</w:t>
+      </w:r>
+      <w:r>
+        <w:t xml:space="preserve"> [8]. HL7’s interoperability standard models clinical data as typed resources such as Patient, Observation, MedicationRequest and Provenance. ABDM uses FHIR-based profiles. LifeTrack’s record model keeps provenance and source on every record so that a later FHIR export can say where each value came from; FHIR export itself is future work (Section 8.3).</w:t>
       </w:r>
     </w:p>
     <w:p>
@@ -2459,10 +2459,10 @@
           <w:b/>
           <w:bCs/>
         </w:rPr>
-        <w:t xml:space="preserve">Ayushman Bharat Digital Mission (ABDM).</w:t>
-      </w:r>
-      <w:r>
-        <w:t xml:space="preserve"> Defines the ABHA number, health information providers and users, and consent artefacts. LifeTrack records an ABHA number as optional, typed in, and shown as “not verified” until ABDM integration exists.</w:t>
+        <w:t xml:space="preserve">Ayushman Bharat Digital Mission (ABDM)</w:t>
+      </w:r>
+      <w:r>
+        <w:t xml:space="preserve"> [6]. Defines the ABHA number, health information providers and users, and consent artefacts. LifeTrack records an ABHA number as optional, typed in, and shown as “not verified” until ABDM integration exists.</w:t>
       </w:r>
     </w:p>
     <w:p>
@@ -2483,7 +2483,7 @@
         <w:t xml:space="preserve">Cryptographic standards.</w:t>
       </w:r>
       <w:r>
-        <w:t xml:space="preserve"> AES-GCM (NIST SP 800-38D) for authenticated encryption; X25519 (RFC 7748) for key agreement; Ed25519 (RFC 8032) for signatures; HKDF (RFC 5869) for key derivation; Argon2id (RFC 9106) for password hashing, using the OWASP-recommended minimum parameters; Shamir’s secret sharing for recovery codes.</w:t>
+        <w:t xml:space="preserve"> AES-GCM (NIST SP 800-38D) [9] for authenticated encryption; X25519 (RFC 7748) [10] for key agreement; Ed25519 (RFC 8032) [11] for signatures; HKDF (RFC 5869) [12] for key derivation; Argon2id (RFC 9106) [13] for password hashing, using the OWASP-recommended minimum parameters [14]; Shamir’s secret sharing [15] for recovery codes.</w:t>
       </w:r>
     </w:p>
     <w:p>
@@ -2501,10 +2501,10 @@
           <w:b/>
           <w:bCs/>
         </w:rPr>
-        <w:t xml:space="preserve">WCAG 2.1 AA.</w:t>
-      </w:r>
-      <w:r>
-        <w:t xml:space="preserve"> Contrast requirements for readable text; the apps are tested against them in both light and dark mode.</w:t>
+        <w:t xml:space="preserve">WCAG 2.1 AA</w:t>
+      </w:r>
+      <w:r>
+        <w:t xml:space="preserve"> [19]. Contrast requirements for readable text; the apps are tested against them in both light and dark mode.</w:t>
       </w:r>
     </w:p>
     <w:p>
@@ -2530,10 +2530,10 @@
           <w:b/>
           <w:bCs/>
         </w:rPr>
-        <w:t xml:space="preserve">Digital Personal Data Protection Act, 2023.</w:t>
-      </w:r>
-      <w:r>
-        <w:t xml:space="preserve"> Requires free, specific, informed and unambiguous consent, purpose limitation, a right of access and erasure, and verifiable parental consent for children (Section 9). LifeTrack implements consent per purpose and time, an export of all data (the access right), erasure, and parent-declared consent for children that stops at 18.</w:t>
+        <w:t xml:space="preserve">Digital Personal Data Protection Act, 2023</w:t>
+      </w:r>
+      <w:r>
+        <w:t xml:space="preserve"> [1]. Under the Act, a person must agree knowingly and voluntarily to each use of their data, data may be used only for the purpose agreed, people may see and erase what is held about them, and a parent must consent for a child (Section 9). LifeTrack implements consent per purpose and time, an export of all data (the access right), erasure, and parent-declared consent for children that stops at 18.</w:t>
       </w:r>
     </w:p>
     <w:p>
@@ -2554,7 +2554,7 @@
         <w:t xml:space="preserve">Aadhaar Act, 2016, Section 29</w:t>
       </w:r>
       <w:r>
-        <w:t xml:space="preserve"> restricts storing and sharing Aadhaar numbers. LifeTrack never asks for or stores an Aadhaar number; LifeTrack IDs always begin with 1 so that they can never be, or validate as, an Aadhaar number.</w:t>
+        <w:t xml:space="preserve"> [2] restricts storing and sharing Aadhaar numbers. LifeTrack never asks for or stores an Aadhaar number; LifeTrack IDs always begin with 1 so that they can never be, or validate as, an Aadhaar number.</w:t>
       </w:r>
     </w:p>
     <w:p>
@@ -2575,7 +2575,7 @@
         <w:t xml:space="preserve">Justice K.S. Puttaswamy v. Union of India (2018)</w:t>
       </w:r>
       <w:r>
-        <w:t xml:space="preserve"> and the 2019 Aadhaar amendment limit mandatory Aadhaar authentication by private entities. The project’s optional “identity required” mode, which verifies every profile through DigiLocker, is therefore flagged for legal review before any pilot (Section 8.2).</w:t>
+        <w:t xml:space="preserve"> [3] and the 2019 Aadhaar amendment [2] limit mandatory Aadhaar authentication by private entities. The project’s optional “identity required” mode, which verifies every profile through DigiLocker, is therefore flagged for legal review before any pilot (Section 8.2).</w:t>
       </w:r>
     </w:p>
     <w:p>
@@ -2596,7 +2596,7 @@
         <w:t xml:space="preserve">Telemedicine Practice Guidelines, 2020</w:t>
       </w:r>
       <w:r>
-        <w:t xml:space="preserve"> require a doctor to keep a record of the consultation and prescription. LifeTrack therefore never promises that a doctor “keeps no copy”; it says that shared records close when access ends.</w:t>
+        <w:t xml:space="preserve"> [5] require a doctor to keep a record of the consultation and prescription. LifeTrack therefore never promises that a doctor “keeps no copy”; it says that shared records close when access ends.</w:t>
       </w:r>
     </w:p>
     <w:p>
@@ -2617,7 +2617,7 @@
         <w:t xml:space="preserve">Information Technology (SPDI) Rules, 2011</w:t>
       </w:r>
       <w:r>
-        <w:t xml:space="preserve"> apply to sensitive personal data, including health data, until the DPDP Rules commence.</w:t>
+        <w:t xml:space="preserve"> [4] apply to sensitive personal data, including health data, until the DPDP Rules commence.</w:t>
       </w:r>
     </w:p>
     <w:p>
@@ -2634,7 +2634,7 @@
         <w:jc w:val="both"/>
       </w:pPr>
       <w:r>
-        <w:t xml:space="preserve">The local-first software movement argues that the user’s device should hold the authoritative copy of their data, with the network used to sync and collaborate, not to hold the data. End-to-end encryption, familiar from messaging, shows that a relay can carry data it cannot read. Clinical-safety guidance for software as a medical device distinguishes between displaying information (low risk) and diagnosing or predicting (regulated). LifeTrack combines these: a local-first record, an end-to-end encrypted relay, and insights that state only position and movement and route the patient to a person.</w:t>
+        <w:t xml:space="preserve">Kleppmann et al. [17] describe local-first software, in which the main copy of the data stays on the user’s own device and the network is used only to sync it and work with others. End-to-end encryption, familiar from messaging, shows that a relay can carry data it cannot read. Clinical-safety guidance for software as a medical device [21] distinguishes between displaying information (low risk) and diagnosing or predicting (regulated). LifeTrack combines these: a local-first record, an end-to-end encrypted relay, and insights that state only position and movement and route the patient to a person.</w:t>
       </w:r>
     </w:p>
     <w:p>
@@ -7249,7 +7249,7 @@
         <w:t xml:space="preserve">Technical.</w:t>
       </w:r>
       <w:r>
-        <w:t xml:space="preserve"> Flutter and Dart provide mature cryptography, camera, QR and notification support; Tesseract runs fully on-device. Every required flow works end to end in the prototype.</w:t>
+        <w:t xml:space="preserve"> Flutter and Dart [20] provide mature cryptography, camera, QR and notification support; Tesseract runs fully on-device. Every required flow works end to end in the prototype.</w:t>
       </w:r>
     </w:p>
     <w:p>
@@ -8531,7 +8531,7 @@
         <w:jc w:val="both"/>
       </w:pPr>
       <w:r>
-        <w:t xml:space="preserve">The twelfth digit of a LifeTrack ID is computed with the Verhoeff algorithm, which uses the multiplication table of the dihedral group D5, a permutation table and an inverse table. Unlike a simple sum-of-digits check, it detects every single-digit error and every transposition of two adjacent digits, the two most common mistakes when an ID is read out or typed. The first digit is fixed at 1 so that no LifeTrack ID can be mistaken for, or validate as, an Aadhaar number.</w:t>
+        <w:t xml:space="preserve">The twelfth digit of a LifeTrack ID is computed with the Verhoeff algorithm [16], which uses the multiplication table of the dihedral group D5, a permutation table and an inverse table. Unlike a simple sum-of-digits check, it detects every single-digit error and every transposition of two adjacent digits, the two most common mistakes when an ID is read out or typed. The first digit is fixed at 1 so that no LifeTrack ID can be mistaken for, or validate as, an Aadhaar number.</w:t>
       </w:r>
     </w:p>
     <w:p>
@@ -8548,7 +8548,7 @@
         <w:jc w:val="both"/>
       </w:pPr>
       <w:r>
-        <w:t xml:space="preserve">The backup password is stretched with Argon2id using the OWASP minimum parameters: 19 MiB of memory (19,456 KiB), 2 passes and 1 lane, producing a 32-byte root key. At this cost the derivation is slow enough to drop frames, so it runs on a background isolate. HKDF-SHA256 then derives two independent 32-byte keys from the root using different labels: the vault key (lifetrack/v1/vault-key), which never leaves the phone, and the login verifier (lifetrack/v1/login-verifier), which is sent to the server so that it can release the locked backup. Test builds use weaker parameters, and that code path throws an error in a release build.</w:t>
+        <w:t xml:space="preserve">The backup password is stretched with Argon2id [13] using the OWASP minimum parameters [14]: 19 MiB of memory (19,456 KiB), 2 passes and 1 lane, producing a 32-byte root key. At this cost the derivation is slow enough to drop frames, so it runs on a background isolate. HKDF-SHA256 [12] then derives two independent 32-byte keys from the root using different labels: the vault key (lifetrack/v1/vault-key), which never leaves the phone, and the login verifier (lifetrack/v1/login-verifier), which is sent to the server so that it can release the locked backup. Test builds use weaker parameters, and that code path throws an error in a release build.</w:t>
       </w:r>
     </w:p>
     <w:p>
@@ -8565,7 +8565,7 @@
         <w:jc w:val="both"/>
       </w:pPr>
       <w:r>
-        <w:t xml:space="preserve">The random data key that encrypts the backup is split with Shamir’s scheme over the finite field GF(2^8) into three shares, any two of which rebuild it; one share alone reveals nothing. Each share carries its index, the threshold and an identifier of the split, and is printed as a recovery code of the form LT1-index-threshold-splitId-hex. Combining fewer shares than the threshold, or shares from different splits, is refused instead of producing a wrong key.</w:t>
+        <w:t xml:space="preserve">The random data key that encrypts the backup is split with Shamir’s scheme [15] over the finite field GF(2^8) into three shares, any two of which rebuild it; one share alone reveals nothing. Each share carries its index, the threshold and an identifier of the split, and is printed as a recovery code of the form LT1-index-threshold-splitId-hex. Combining fewer shares than the threshold, or shares from different splits, is refused instead of producing a wrong key.</w:t>
       </w:r>
     </w:p>
     <w:p>
@@ -11522,7 +11522,7 @@
         <w:jc w:val="both"/>
       </w:pPr>
       <w:r>
-        <w:t xml:space="preserve">A page arrives from the camera, the photo library, a PDF or another app’s share sheet. The image is straightened, resized and stripped of metadata, then passed to Tesseract in the Android activity. A parser recognises test names, values, units and printed ranges. Any field read with confidence below 0.85, and every handwritten field, must be ticked or corrected before the patient confirms that the draft matches the report. The original image is kept, encrypted, with the record.</w:t>
+        <w:t xml:space="preserve">A page arrives from the camera, the photo library, a PDF or another app’s share sheet. The image is straightened, resized and stripped of metadata, then passed to Tesseract [18] in the Android activity. A parser recognises test names, values, units and printed ranges. Any field read with confidence below 0.85, and every handwritten field, must be ticked or corrected before the patient confirms that the draft matches the report. The original image is kept, encrypted, with the record.</w:t>
       </w:r>
     </w:p>
     <w:p>
@@ -13185,7 +13185,7 @@
         <w:jc w:val="both"/>
       </w:pPr>
       <w:r>
-        <w:t xml:space="preserve">The child vaccination schedule follows India’s Universal Immunisation Programme as published by the Ministry of Health and Family Welfare: 26 doses from birth (BCG, OPV 0, hepatitis B) to 16 years. Each dose has an age at which it falls due, and the app computes due dates from the child’s date of birth. The screen advises following the child’s doctor where a private schedule adds vaccines.</w:t>
+        <w:t xml:space="preserve">The child vaccination schedule follows India’s Universal Immunisation Programme as published by the Ministry of Health and Family Welfare [7]: 26 doses from birth (BCG, OPV 0, hepatitis B) to 16 years. Each dose has an age at which it falls due, and the app computes due dates from the child’s date of birth. The screen advises following the child’s doctor where a private schedule adds vaccines.</w:t>
       </w:r>
     </w:p>
     <w:p>

</xml_diff>